<commit_message>
Implemented BL leave CRUD operations
</commit_message>
<xml_diff>
--- a/Documentation/AI Prompts/Vibe Coding - Leave Request.docx
+++ b/Documentation/AI Prompts/Vibe Coding - Leave Request.docx
@@ -453,25 +453,7 @@
         <w:rPr>
           <w:lang w:val="en-GB"/>
         </w:rPr>
-        <w:t xml:space="preserve"> - </w:t>
-      </w:r>
-      <w:r>
-        <w:rPr>
-          <w:lang w:val="en-GB"/>
-        </w:rPr>
-        <w:t xml:space="preserve">a date field that represents the </w:t>
-      </w:r>
-      <w:r>
-        <w:rPr>
-          <w:lang w:val="en-GB"/>
-        </w:rPr>
-        <w:t>ending</w:t>
-      </w:r>
-      <w:r>
-        <w:rPr>
-          <w:lang w:val="en-GB"/>
-        </w:rPr>
-        <w:t xml:space="preserve"> period of the leave duration</w:t>
+        <w:t xml:space="preserve"> - a date field that represents the ending period of the leave duration</w:t>
       </w:r>
       <w:r>
         <w:rPr>
@@ -503,25 +485,7 @@
         <w:rPr>
           <w:lang w:val="en-GB"/>
         </w:rPr>
-        <w:t xml:space="preserve"> - </w:t>
-      </w:r>
-      <w:r>
-        <w:rPr>
-          <w:lang w:val="en-GB"/>
-        </w:rPr>
-        <w:t xml:space="preserve">a drop-down list that contains the modes of leave </w:t>
-      </w:r>
-      <w:r>
-        <w:rPr>
-          <w:lang w:val="en-GB"/>
-        </w:rPr>
-        <w:t>end</w:t>
-      </w:r>
-      <w:r>
-        <w:rPr>
-          <w:lang w:val="en-GB"/>
-        </w:rPr>
-        <w:t xml:space="preserve"> period which can be any of the following options:</w:t>
+        <w:t xml:space="preserve"> - a drop-down list that contains the modes of leave end period which can be any of the following options:</w:t>
       </w:r>
     </w:p>
     <w:p>
@@ -1019,6 +983,12 @@
           <w:lang w:val="en-GB"/>
         </w:rPr>
         <w:t xml:space="preserve"> ver. 8.8.0</w:t>
+      </w:r>
+      <w:r>
+        <w:rPr>
+          <w:lang w:val="en-GB"/>
+        </w:rPr>
+        <w:t>. Provide production-ready complete code for the domain model, business logic, and UI code-behind.</w:t>
       </w:r>
     </w:p>
     <w:p>

</xml_diff>

<commit_message>
Working on the calculation of leave duration and constraints
</commit_message>
<xml_diff>
--- a/Documentation/AI Prompts/Vibe Coding - Leave Request.docx
+++ b/Documentation/AI Prompts/Vibe Coding - Leave Request.docx
@@ -617,21 +617,7 @@
         <w:rPr>
           <w:lang w:val="en-GB"/>
         </w:rPr>
-        <w:t xml:space="preserve">– a </w:t>
-      </w:r>
-      <w:proofErr w:type="spellStart"/>
-      <w:r>
-        <w:rPr>
-          <w:lang w:val="en-GB"/>
-        </w:rPr>
-        <w:t>MudFileUpload</w:t>
-      </w:r>
-      <w:proofErr w:type="spellEnd"/>
-      <w:r>
-        <w:rPr>
-          <w:lang w:val="en-GB"/>
-        </w:rPr>
-        <w:t xml:space="preserve"> component that allows users to upload multiple files into the leave request, which need to be saved in the database</w:t>
+        <w:t>– a MudFileUpload component that allows users to upload multiple files into the leave request, which need to be saved in the database</w:t>
       </w:r>
     </w:p>
     <w:p>
@@ -968,16 +954,8 @@
         <w:rPr>
           <w:lang w:val="en-GB"/>
         </w:rPr>
-        <w:t xml:space="preserve"> mobile phones and tablets are the main viewport so that the page will adjust automatically. Note that I am using .NET 8.0 and </w:t>
-      </w:r>
-      <w:proofErr w:type="spellStart"/>
-      <w:r>
-        <w:rPr>
-          <w:lang w:val="en-GB"/>
-        </w:rPr>
-        <w:t>MudBlazor</w:t>
-      </w:r>
-      <w:proofErr w:type="spellEnd"/>
+        <w:t xml:space="preserve"> mobile phones and tablets are the main viewport so that the page will adjust automatically. Note that I am using .NET 8.0 and MudBlazor</w:t>
+      </w:r>
       <w:r>
         <w:rPr>
           <w:lang w:val="en-GB"/>
@@ -989,6 +967,57 @@
           <w:lang w:val="en-GB"/>
         </w:rPr>
         <w:t>. Provide production-ready complete code for the domain model, business logic, and UI code-behind.</w:t>
+      </w:r>
+    </w:p>
+    <w:p>
+      <w:pPr>
+        <w:rPr>
+          <w:b/>
+          <w:bCs/>
+          <w:color w:val="EE0000"/>
+          <w:u w:val="single"/>
+        </w:rPr>
+      </w:pPr>
+      <w:r>
+        <w:rPr>
+          <w:b/>
+          <w:bCs/>
+          <w:color w:val="EE0000"/>
+          <w:u w:val="single"/>
+        </w:rPr>
+        <w:t>Prompt</w:t>
+      </w:r>
+      <w:r>
+        <w:rPr>
+          <w:b/>
+          <w:bCs/>
+          <w:color w:val="EE0000"/>
+          <w:u w:val="single"/>
+        </w:rPr>
+        <w:t xml:space="preserve"> #</w:t>
+      </w:r>
+      <w:r>
+        <w:rPr>
+          <w:b/>
+          <w:bCs/>
+          <w:color w:val="EE0000"/>
+          <w:u w:val="single"/>
+        </w:rPr>
+        <w:t>2</w:t>
+      </w:r>
+      <w:r>
+        <w:rPr>
+          <w:b/>
+          <w:bCs/>
+          <w:color w:val="EE0000"/>
+          <w:u w:val="single"/>
+        </w:rPr>
+        <w:t>:</w:t>
+      </w:r>
+    </w:p>
+    <w:p>
+      <w:r>
+        <w:t>I want to design a Leave Request form for my HRMS Blazor Server application. This form should have the following attributes and functionalities:</w:t>
       </w:r>
     </w:p>
     <w:p>
@@ -3547,7 +3576,7 @@
   <w:style w:type="paragraph" w:default="1" w:styleId="Normal">
     <w:name w:val="Normal"/>
     <w:qFormat/>
-    <w:rsid w:val="00A21DB0"/>
+    <w:rsid w:val="005E391A"/>
   </w:style>
   <w:style w:type="paragraph" w:styleId="Heading1">
     <w:name w:val="heading 1"/>

</xml_diff>

<commit_message>
Performed test case scenarios
</commit_message>
<xml_diff>
--- a/Documentation/AI Prompts/Vibe Coding - Leave Request.docx
+++ b/Documentation/AI Prompts/Vibe Coding - Leave Request.docx
@@ -994,7 +994,7 @@
           <w:color w:val="EE0000"/>
           <w:u w:val="single"/>
         </w:rPr>
-        <w:t xml:space="preserve"> #</w:t>
+        <w:t xml:space="preserve"> #2</w:t>
       </w:r>
       <w:r>
         <w:rPr>
@@ -1003,21 +1003,429 @@
           <w:color w:val="EE0000"/>
           <w:u w:val="single"/>
         </w:rPr>
-        <w:t>2</w:t>
+        <w:t>:</w:t>
+      </w:r>
+    </w:p>
+    <w:p>
+      <w:r>
+        <w:t>Below is the razor code for rendering the “Start Day Mode” field:</w:t>
+      </w:r>
+    </w:p>
+    <w:p>
+      <w:pPr>
+        <w:spacing w:after="0"/>
+        <w:rPr>
+          <w:lang w:val="en-GB"/>
+        </w:rPr>
+      </w:pPr>
+      <w:r>
+        <w:rPr>
+          <w:lang w:val="en-GB"/>
+        </w:rPr>
+        <w:t>&lt;</w:t>
       </w:r>
       <w:r>
         <w:rPr>
           <w:b/>
           <w:bCs/>
-          <w:color w:val="EE0000"/>
-          <w:u w:val="single"/>
-        </w:rPr>
-        <w:t>:</w:t>
-      </w:r>
-    </w:p>
-    <w:p>
-      <w:r>
-        <w:t>I want to design a Leave Request form for my HRMS Blazor Server application. This form should have the following attributes and functionalities:</w:t>
+          <w:lang w:val="en-GB"/>
+        </w:rPr>
+        <w:t>MudAutocomplete</w:t>
+      </w:r>
+      <w:r>
+        <w:rPr>
+          <w:lang w:val="en-GB"/>
+        </w:rPr>
+        <w:t xml:space="preserve"> @bind-Value="_leaveRequest.StartDayModeDesc"</w:t>
+      </w:r>
+    </w:p>
+    <w:p>
+      <w:pPr>
+        <w:spacing w:after="0"/>
+        <w:rPr>
+          <w:lang w:val="en-GB"/>
+        </w:rPr>
+      </w:pPr>
+      <w:r>
+        <w:rPr>
+          <w:lang w:val="en-GB"/>
+        </w:rPr>
+        <w:t xml:space="preserve">                 </w:t>
+      </w:r>
+      <w:r>
+        <w:rPr>
+          <w:b/>
+          <w:bCs/>
+          <w:lang w:val="en-GB"/>
+        </w:rPr>
+        <w:t>For</w:t>
+      </w:r>
+      <w:r>
+        <w:rPr>
+          <w:lang w:val="en-GB"/>
+        </w:rPr>
+        <w:t>="@(() =&gt; _leaveRequest.StartDayModeDesc)"</w:t>
+      </w:r>
+    </w:p>
+    <w:p>
+      <w:pPr>
+        <w:spacing w:after="0"/>
+        <w:rPr>
+          <w:lang w:val="en-GB"/>
+        </w:rPr>
+      </w:pPr>
+      <w:r>
+        <w:rPr>
+          <w:lang w:val="en-GB"/>
+        </w:rPr>
+        <w:t xml:space="preserve">                 </w:t>
+      </w:r>
+      <w:r>
+        <w:rPr>
+          <w:b/>
+          <w:bCs/>
+          <w:lang w:val="en-GB"/>
+        </w:rPr>
+        <w:t>SearchFunc</w:t>
+      </w:r>
+      <w:r>
+        <w:rPr>
+          <w:lang w:val="en-GB"/>
+        </w:rPr>
+        <w:t>="SearchLeaveMode!"</w:t>
+      </w:r>
+    </w:p>
+    <w:p>
+      <w:pPr>
+        <w:spacing w:after="0"/>
+        <w:rPr>
+          <w:lang w:val="en-GB"/>
+        </w:rPr>
+      </w:pPr>
+      <w:r>
+        <w:rPr>
+          <w:lang w:val="en-GB"/>
+        </w:rPr>
+        <w:t xml:space="preserve">                 </w:t>
+      </w:r>
+      <w:r>
+        <w:rPr>
+          <w:b/>
+          <w:bCs/>
+          <w:lang w:val="en-GB"/>
+        </w:rPr>
+        <w:t>Variant</w:t>
+      </w:r>
+      <w:r>
+        <w:rPr>
+          <w:lang w:val="en-GB"/>
+        </w:rPr>
+        <w:t>="Variant.Text"</w:t>
+      </w:r>
+    </w:p>
+    <w:p>
+      <w:pPr>
+        <w:spacing w:after="0"/>
+        <w:rPr>
+          <w:lang w:val="en-GB"/>
+        </w:rPr>
+      </w:pPr>
+      <w:r>
+        <w:rPr>
+          <w:lang w:val="en-GB"/>
+        </w:rPr>
+        <w:t xml:space="preserve">                 </w:t>
+      </w:r>
+      <w:r>
+        <w:rPr>
+          <w:b/>
+          <w:bCs/>
+          <w:lang w:val="en-GB"/>
+        </w:rPr>
+        <w:t>Label</w:t>
+      </w:r>
+      <w:r>
+        <w:rPr>
+          <w:lang w:val="en-GB"/>
+        </w:rPr>
+        <w:t>="Start Day Mode"</w:t>
+      </w:r>
+    </w:p>
+    <w:p>
+      <w:pPr>
+        <w:spacing w:after="0"/>
+        <w:rPr>
+          <w:lang w:val="en-GB"/>
+        </w:rPr>
+      </w:pPr>
+      <w:r>
+        <w:rPr>
+          <w:lang w:val="en-GB"/>
+        </w:rPr>
+        <w:t xml:space="preserve">                 </w:t>
+      </w:r>
+      <w:r>
+        <w:rPr>
+          <w:b/>
+          <w:bCs/>
+          <w:lang w:val="en-GB"/>
+        </w:rPr>
+        <w:t>Margin</w:t>
+      </w:r>
+      <w:r>
+        <w:rPr>
+          <w:lang w:val="en-GB"/>
+        </w:rPr>
+        <w:t>="Margin.Dense"</w:t>
+      </w:r>
+    </w:p>
+    <w:p>
+      <w:pPr>
+        <w:spacing w:after="0"/>
+        <w:rPr>
+          <w:lang w:val="en-GB"/>
+        </w:rPr>
+      </w:pPr>
+      <w:r>
+        <w:rPr>
+          <w:lang w:val="en-GB"/>
+        </w:rPr>
+        <w:t xml:space="preserve">                 </w:t>
+      </w:r>
+      <w:r>
+        <w:rPr>
+          <w:b/>
+          <w:bCs/>
+          <w:lang w:val="en-GB"/>
+        </w:rPr>
+        <w:t>Dense</w:t>
+      </w:r>
+      <w:r>
+        <w:rPr>
+          <w:lang w:val="en-GB"/>
+        </w:rPr>
+        <w:t>="true"</w:t>
+      </w:r>
+    </w:p>
+    <w:p>
+      <w:pPr>
+        <w:spacing w:after="0"/>
+        <w:rPr>
+          <w:lang w:val="en-GB"/>
+        </w:rPr>
+      </w:pPr>
+      <w:r>
+        <w:rPr>
+          <w:lang w:val="en-GB"/>
+        </w:rPr>
+        <w:t xml:space="preserve">                 </w:t>
+      </w:r>
+      <w:r>
+        <w:rPr>
+          <w:b/>
+          <w:bCs/>
+          <w:lang w:val="en-GB"/>
+        </w:rPr>
+        <w:t>Placeholder</w:t>
+      </w:r>
+      <w:r>
+        <w:rPr>
+          <w:lang w:val="en-GB"/>
+        </w:rPr>
+        <w:t>="Please Select"</w:t>
+      </w:r>
+    </w:p>
+    <w:p>
+      <w:pPr>
+        <w:spacing w:after="0"/>
+        <w:rPr>
+          <w:lang w:val="en-GB"/>
+        </w:rPr>
+      </w:pPr>
+      <w:r>
+        <w:rPr>
+          <w:lang w:val="en-GB"/>
+        </w:rPr>
+        <w:t xml:space="preserve">                 </w:t>
+      </w:r>
+      <w:r>
+        <w:rPr>
+          <w:b/>
+          <w:bCs/>
+          <w:lang w:val="en-GB"/>
+        </w:rPr>
+        <w:t>HelperText</w:t>
+      </w:r>
+      <w:r>
+        <w:rPr>
+          <w:lang w:val="en-GB"/>
+        </w:rPr>
+        <w:t>="Type a key to search for value"</w:t>
+      </w:r>
+    </w:p>
+    <w:p>
+      <w:pPr>
+        <w:spacing w:after="0"/>
+        <w:rPr>
+          <w:lang w:val="en-GB"/>
+        </w:rPr>
+      </w:pPr>
+      <w:r>
+        <w:rPr>
+          <w:lang w:val="en-GB"/>
+        </w:rPr>
+        <w:t xml:space="preserve">                 </w:t>
+      </w:r>
+      <w:r>
+        <w:rPr>
+          <w:b/>
+          <w:bCs/>
+          <w:lang w:val="en-GB"/>
+        </w:rPr>
+        <w:t>HelperTextOnFocus</w:t>
+      </w:r>
+      <w:r>
+        <w:rPr>
+          <w:lang w:val="en-GB"/>
+        </w:rPr>
+        <w:t>="true"</w:t>
+      </w:r>
+    </w:p>
+    <w:p>
+      <w:pPr>
+        <w:spacing w:after="0"/>
+        <w:rPr>
+          <w:lang w:val="en-GB"/>
+        </w:rPr>
+      </w:pPr>
+      <w:r>
+        <w:rPr>
+          <w:lang w:val="en-GB"/>
+        </w:rPr>
+        <w:t xml:space="preserve">                 </w:t>
+      </w:r>
+      <w:r>
+        <w:rPr>
+          <w:b/>
+          <w:bCs/>
+          <w:lang w:val="en-GB"/>
+        </w:rPr>
+        <w:t>Clearable</w:t>
+      </w:r>
+      <w:r>
+        <w:rPr>
+          <w:lang w:val="en-GB"/>
+        </w:rPr>
+        <w:t>="true"</w:t>
+      </w:r>
+    </w:p>
+    <w:p>
+      <w:pPr>
+        <w:spacing w:after="0"/>
+        <w:rPr>
+          <w:lang w:val="en-GB"/>
+        </w:rPr>
+      </w:pPr>
+      <w:r>
+        <w:rPr>
+          <w:lang w:val="en-GB"/>
+        </w:rPr>
+        <w:t xml:space="preserve">                 </w:t>
+      </w:r>
+      <w:r>
+        <w:rPr>
+          <w:b/>
+          <w:bCs/>
+          <w:lang w:val="en-GB"/>
+        </w:rPr>
+        <w:t>Typo</w:t>
+      </w:r>
+      <w:r>
+        <w:rPr>
+          <w:lang w:val="en-GB"/>
+        </w:rPr>
+        <w:t>="Typo.subtitle2"</w:t>
+      </w:r>
+    </w:p>
+    <w:p>
+      <w:pPr>
+        <w:spacing w:after="0"/>
+        <w:rPr>
+          <w:lang w:val="en-GB"/>
+        </w:rPr>
+      </w:pPr>
+      <w:r>
+        <w:rPr>
+          <w:lang w:val="en-GB"/>
+        </w:rPr>
+        <w:t xml:space="preserve">                 </w:t>
+      </w:r>
+      <w:r>
+        <w:rPr>
+          <w:b/>
+          <w:bCs/>
+          <w:lang w:val="en-GB"/>
+        </w:rPr>
+        <w:t>Disabled</w:t>
+      </w:r>
+      <w:r>
+        <w:rPr>
+          <w:lang w:val="en-GB"/>
+        </w:rPr>
+        <w:t>="@_isDisabled"</w:t>
+      </w:r>
+    </w:p>
+    <w:p>
+      <w:pPr>
+        <w:spacing w:after="0"/>
+        <w:rPr>
+          <w:lang w:val="en-GB"/>
+        </w:rPr>
+      </w:pPr>
+      <w:r>
+        <w:rPr>
+          <w:lang w:val="en-GB"/>
+        </w:rPr>
+        <w:t xml:space="preserve">                 </w:t>
+      </w:r>
+      <w:r>
+        <w:rPr>
+          <w:b/>
+          <w:bCs/>
+          <w:lang w:val="en-GB"/>
+        </w:rPr>
+        <w:t>MaxItems</w:t>
+      </w:r>
+      <w:r>
+        <w:rPr>
+          <w:lang w:val="en-GB"/>
+        </w:rPr>
+        <w:t>="@(_leaveModeList != null ? _leaveModeList.Count : 10)"</w:t>
+      </w:r>
+    </w:p>
+    <w:p>
+      <w:pPr>
+        <w:spacing w:after="0"/>
+      </w:pPr>
+      <w:r>
+        <w:rPr>
+          <w:lang w:val="en-GB"/>
+        </w:rPr>
+        <w:t xml:space="preserve">                 </w:t>
+      </w:r>
+      <w:r>
+        <w:rPr>
+          <w:b/>
+          <w:bCs/>
+          <w:lang w:val="en-GB"/>
+        </w:rPr>
+        <w:t>Modal</w:t>
+      </w:r>
+      <w:r>
+        <w:rPr>
+          <w:lang w:val="en-GB"/>
+        </w:rPr>
+        <w:t>="true" /&gt;</w:t>
       </w:r>
     </w:p>
     <w:p>
@@ -3780,7 +4188,6 @@
   <w:style w:type="character" w:default="1" w:styleId="DefaultParagraphFont">
     <w:name w:val="Default Paragraph Font"/>
     <w:uiPriority w:val="1"/>
-    <w:semiHidden/>
     <w:unhideWhenUsed/>
   </w:style>
   <w:style w:type="table" w:default="1" w:styleId="TableNormal">

</xml_diff>

<commit_message>
Started working on the attendance regularization
</commit_message>
<xml_diff>
--- a/Documentation/AI Prompts/Vibe Coding - Leave Request.docx
+++ b/Documentation/AI Prompts/Vibe Coding - Leave Request.docx
@@ -617,7 +617,21 @@
         <w:rPr>
           <w:lang w:val="en-GB"/>
         </w:rPr>
-        <w:t>– a MudFileUpload component that allows users to upload multiple files into the leave request, which need to be saved in the database</w:t>
+        <w:t xml:space="preserve">– a </w:t>
+      </w:r>
+      <w:proofErr w:type="spellStart"/>
+      <w:r>
+        <w:rPr>
+          <w:lang w:val="en-GB"/>
+        </w:rPr>
+        <w:t>MudFileUpload</w:t>
+      </w:r>
+      <w:proofErr w:type="spellEnd"/>
+      <w:r>
+        <w:rPr>
+          <w:lang w:val="en-GB"/>
+        </w:rPr>
+        <w:t xml:space="preserve"> component that allows users to upload multiple files into the leave request, which need to be saved in the database</w:t>
       </w:r>
     </w:p>
     <w:p>
@@ -954,8 +968,16 @@
         <w:rPr>
           <w:lang w:val="en-GB"/>
         </w:rPr>
-        <w:t xml:space="preserve"> mobile phones and tablets are the main viewport so that the page will adjust automatically. Note that I am using .NET 8.0 and MudBlazor</w:t>
-      </w:r>
+        <w:t xml:space="preserve"> mobile phones and tablets are the main viewport so that the page will adjust automatically. Note that I am using .NET 8.0 and </w:t>
+      </w:r>
+      <w:proofErr w:type="spellStart"/>
+      <w:r>
+        <w:rPr>
+          <w:lang w:val="en-GB"/>
+        </w:rPr>
+        <w:t>MudBlazor</w:t>
+      </w:r>
+      <w:proofErr w:type="spellEnd"/>
       <w:r>
         <w:rPr>
           <w:lang w:val="en-GB"/>
@@ -1008,433 +1030,4357 @@
     </w:p>
     <w:p>
       <w:r>
-        <w:t>Below is the razor code for rendering the “Start Day Mode” field:</w:t>
-      </w:r>
-    </w:p>
-    <w:p>
-      <w:pPr>
-        <w:spacing w:after="0"/>
-        <w:rPr>
-          <w:lang w:val="en-GB"/>
-        </w:rPr>
-      </w:pPr>
-      <w:r>
-        <w:rPr>
-          <w:lang w:val="en-GB"/>
-        </w:rPr>
-        <w:t>&lt;</w:t>
-      </w:r>
+        <w:t xml:space="preserve">Below is the razor code for </w:t>
+      </w:r>
+      <w:r>
+        <w:t xml:space="preserve">file attachment. Tell me how to clear the list of attachment files that are displayed </w:t>
+      </w:r>
+      <w:proofErr w:type="gramStart"/>
+      <w:r>
+        <w:t xml:space="preserve">on  </w:t>
+      </w:r>
+      <w:proofErr w:type="spellStart"/>
       <w:r>
         <w:rPr>
           <w:b/>
           <w:bCs/>
-          <w:lang w:val="en-GB"/>
-        </w:rPr>
-        <w:t>MudAutocomplete</w:t>
-      </w:r>
-      <w:r>
-        <w:rPr>
-          <w:lang w:val="en-GB"/>
-        </w:rPr>
-        <w:t xml:space="preserve"> @bind-Value="_leaveRequest.StartDayModeDesc"</w:t>
-      </w:r>
-    </w:p>
-    <w:p>
-      <w:pPr>
-        <w:spacing w:after="0"/>
-        <w:rPr>
-          <w:lang w:val="en-GB"/>
-        </w:rPr>
-      </w:pPr>
-      <w:r>
-        <w:rPr>
-          <w:lang w:val="en-GB"/>
-        </w:rPr>
-        <w:t xml:space="preserve">                 </w:t>
-      </w:r>
+        </w:rPr>
+        <w:t>MudChipSet</w:t>
+      </w:r>
+      <w:proofErr w:type="spellEnd"/>
+      <w:proofErr w:type="gramEnd"/>
       <w:r>
         <w:rPr>
           <w:b/>
           <w:bCs/>
-          <w:lang w:val="en-GB"/>
-        </w:rPr>
-        <w:t>For</w:t>
-      </w:r>
-      <w:r>
-        <w:rPr>
-          <w:lang w:val="en-GB"/>
-        </w:rPr>
-        <w:t>="@(() =&gt; _leaveRequest.StartDayModeDesc)"</w:t>
-      </w:r>
-    </w:p>
-    <w:p>
-      <w:pPr>
-        <w:spacing w:after="0"/>
-        <w:rPr>
-          <w:lang w:val="en-GB"/>
-        </w:rPr>
-      </w:pPr>
-      <w:r>
-        <w:rPr>
-          <w:lang w:val="en-GB"/>
-        </w:rPr>
-        <w:t xml:space="preserve">                 </w:t>
-      </w:r>
+        </w:rPr>
+        <w:t xml:space="preserve"> </w:t>
+      </w:r>
+      <w:r>
+        <w:t>component when the Reset button is clicked.</w:t>
+      </w:r>
+    </w:p>
+    <w:p>
+      <w:pPr>
+        <w:spacing w:after="0" w:line="240" w:lineRule="auto"/>
+      </w:pPr>
+      <w:r>
+        <w:t>&lt;</w:t>
+      </w:r>
+      <w:proofErr w:type="spellStart"/>
       <w:r>
         <w:rPr>
           <w:b/>
           <w:bCs/>
-          <w:lang w:val="en-GB"/>
-        </w:rPr>
-        <w:t>SearchFunc</w:t>
-      </w:r>
-      <w:r>
-        <w:rPr>
-          <w:lang w:val="en-GB"/>
-        </w:rPr>
-        <w:t>="SearchLeaveMode!"</w:t>
-      </w:r>
-    </w:p>
-    <w:p>
-      <w:pPr>
-        <w:spacing w:after="0"/>
-        <w:rPr>
-          <w:lang w:val="en-GB"/>
-        </w:rPr>
-      </w:pPr>
-      <w:r>
-        <w:rPr>
-          <w:lang w:val="en-GB"/>
-        </w:rPr>
-        <w:t xml:space="preserve">                 </w:t>
+        </w:rPr>
+        <w:t>MudStack</w:t>
+      </w:r>
+      <w:proofErr w:type="spellEnd"/>
+      <w:r>
+        <w:t xml:space="preserve"> </w:t>
       </w:r>
       <w:r>
         <w:rPr>
           <w:b/>
           <w:bCs/>
-          <w:lang w:val="en-GB"/>
-        </w:rPr>
-        <w:t>Variant</w:t>
-      </w:r>
-      <w:r>
-        <w:rPr>
-          <w:lang w:val="en-GB"/>
-        </w:rPr>
-        <w:t>="Variant.Text"</w:t>
-      </w:r>
-    </w:p>
-    <w:p>
-      <w:pPr>
-        <w:spacing w:after="0"/>
-        <w:rPr>
-          <w:lang w:val="en-GB"/>
-        </w:rPr>
-      </w:pPr>
-      <w:r>
-        <w:rPr>
-          <w:lang w:val="en-GB"/>
-        </w:rPr>
-        <w:t xml:space="preserve">                 </w:t>
-      </w:r>
+        </w:rPr>
+        <w:t>Justify</w:t>
+      </w:r>
+      <w:r>
+        <w:t>="</w:t>
+      </w:r>
+      <w:proofErr w:type="spellStart"/>
+      <w:r>
+        <w:t>Justify.FlexStart</w:t>
+      </w:r>
+      <w:proofErr w:type="spellEnd"/>
+      <w:r>
+        <w:t xml:space="preserve">" </w:t>
+      </w:r>
+      <w:proofErr w:type="spellStart"/>
       <w:r>
         <w:rPr>
           <w:b/>
           <w:bCs/>
-          <w:lang w:val="en-GB"/>
-        </w:rPr>
-        <w:t>Label</w:t>
-      </w:r>
-      <w:r>
-        <w:rPr>
-          <w:lang w:val="en-GB"/>
-        </w:rPr>
-        <w:t>="Start Day Mode"</w:t>
-      </w:r>
-    </w:p>
-    <w:p>
-      <w:pPr>
-        <w:spacing w:after="0"/>
-        <w:rPr>
-          <w:lang w:val="en-GB"/>
-        </w:rPr>
-      </w:pPr>
-      <w:r>
-        <w:rPr>
-          <w:lang w:val="en-GB"/>
-        </w:rPr>
-        <w:t xml:space="preserve">                 </w:t>
+        </w:rPr>
+        <w:t>AlignItems</w:t>
+      </w:r>
+      <w:proofErr w:type="spellEnd"/>
+      <w:r>
+        <w:t>="</w:t>
+      </w:r>
+      <w:proofErr w:type="spellStart"/>
+      <w:r>
+        <w:t>AlignItems.Start</w:t>
+      </w:r>
+      <w:proofErr w:type="spellEnd"/>
+      <w:r>
+        <w:t xml:space="preserve">" </w:t>
       </w:r>
       <w:r>
         <w:rPr>
           <w:b/>
           <w:bCs/>
-          <w:lang w:val="en-GB"/>
-        </w:rPr>
-        <w:t>Margin</w:t>
-      </w:r>
-      <w:r>
-        <w:rPr>
-          <w:lang w:val="en-GB"/>
-        </w:rPr>
-        <w:t>="Margin.Dense"</w:t>
-      </w:r>
-    </w:p>
-    <w:p>
-      <w:pPr>
-        <w:spacing w:after="0"/>
-        <w:rPr>
-          <w:lang w:val="en-GB"/>
-        </w:rPr>
-      </w:pPr>
-      <w:r>
-        <w:rPr>
-          <w:lang w:val="en-GB"/>
-        </w:rPr>
-        <w:t xml:space="preserve">                 </w:t>
-      </w:r>
+        </w:rPr>
+        <w:t>Class</w:t>
+      </w:r>
+      <w:r>
+        <w:t>="mud-width-full"&gt;</w:t>
+      </w:r>
+    </w:p>
+    <w:p>
+      <w:pPr>
+        <w:spacing w:after="0" w:line="240" w:lineRule="auto"/>
+      </w:pPr>
+      <w:r>
+        <w:t xml:space="preserve">    &lt;</w:t>
+      </w:r>
+      <w:proofErr w:type="spellStart"/>
       <w:r>
         <w:rPr>
           <w:b/>
           <w:bCs/>
-          <w:lang w:val="en-GB"/>
-        </w:rPr>
-        <w:t>Dense</w:t>
-      </w:r>
-      <w:r>
-        <w:rPr>
-          <w:lang w:val="en-GB"/>
-        </w:rPr>
-        <w:t>="true"</w:t>
-      </w:r>
-    </w:p>
-    <w:p>
-      <w:pPr>
-        <w:spacing w:after="0"/>
-        <w:rPr>
-          <w:lang w:val="en-GB"/>
-        </w:rPr>
-      </w:pPr>
-      <w:r>
-        <w:rPr>
-          <w:lang w:val="en-GB"/>
-        </w:rPr>
-        <w:t xml:space="preserve">                 </w:t>
+        </w:rPr>
+        <w:t>MudFileUpload</w:t>
+      </w:r>
+      <w:proofErr w:type="spellEnd"/>
+      <w:r>
+        <w:t xml:space="preserve"> @bind-Files="_files"</w:t>
+      </w:r>
+    </w:p>
+    <w:p>
+      <w:pPr>
+        <w:spacing w:after="0" w:line="240" w:lineRule="auto"/>
+      </w:pPr>
+      <w:r>
+        <w:t xml:space="preserve">                   </w:t>
       </w:r>
       <w:r>
         <w:rPr>
           <w:b/>
           <w:bCs/>
-          <w:lang w:val="en-GB"/>
-        </w:rPr>
-        <w:t>Placeholder</w:t>
-      </w:r>
-      <w:r>
-        <w:rPr>
-          <w:lang w:val="en-GB"/>
-        </w:rPr>
-        <w:t>="Please Select"</w:t>
-      </w:r>
-    </w:p>
-    <w:p>
-      <w:pPr>
-        <w:spacing w:after="0"/>
-        <w:rPr>
-          <w:lang w:val="en-GB"/>
-        </w:rPr>
-      </w:pPr>
-      <w:r>
-        <w:rPr>
-          <w:lang w:val="en-GB"/>
-        </w:rPr>
-        <w:t xml:space="preserve">                 </w:t>
+        </w:rPr>
+        <w:t>Class</w:t>
+      </w:r>
+      <w:r>
+        <w:t>="mt-1"</w:t>
+      </w:r>
+    </w:p>
+    <w:p>
+      <w:pPr>
+        <w:spacing w:after="0" w:line="240" w:lineRule="auto"/>
+      </w:pPr>
+      <w:r>
+        <w:t xml:space="preserve">                   </w:t>
       </w:r>
       <w:r>
         <w:rPr>
           <w:b/>
           <w:bCs/>
-          <w:lang w:val="en-GB"/>
-        </w:rPr>
-        <w:t>HelperText</w:t>
-      </w:r>
-      <w:r>
-        <w:rPr>
-          <w:lang w:val="en-GB"/>
-        </w:rPr>
-        <w:t>="Type a key to search for value"</w:t>
-      </w:r>
-    </w:p>
-    <w:p>
-      <w:pPr>
-        <w:spacing w:after="0"/>
-        <w:rPr>
-          <w:lang w:val="en-GB"/>
-        </w:rPr>
-      </w:pPr>
-      <w:r>
-        <w:rPr>
-          <w:lang w:val="en-GB"/>
-        </w:rPr>
-        <w:t xml:space="preserve">                 </w:t>
-      </w:r>
+        </w:rPr>
+        <w:t>Accept</w:t>
+      </w:r>
+      <w:r>
+        <w:t>=".doc,.docx,.xls,.xlsx,.csv,.ppt,.pptx,.pdf,.png,.jpg"</w:t>
+      </w:r>
+    </w:p>
+    <w:p>
+      <w:pPr>
+        <w:spacing w:after="0" w:line="240" w:lineRule="auto"/>
+      </w:pPr>
+      <w:r>
+        <w:t xml:space="preserve">                   </w:t>
+      </w:r>
+      <w:proofErr w:type="spellStart"/>
       <w:r>
         <w:rPr>
           <w:b/>
           <w:bCs/>
-          <w:lang w:val="en-GB"/>
-        </w:rPr>
-        <w:t>HelperTextOnFocus</w:t>
-      </w:r>
-      <w:r>
-        <w:rPr>
-          <w:lang w:val="en-GB"/>
-        </w:rPr>
-        <w:t>="true"</w:t>
-      </w:r>
-    </w:p>
-    <w:p>
-      <w:pPr>
-        <w:spacing w:after="0"/>
-        <w:rPr>
-          <w:lang w:val="en-GB"/>
-        </w:rPr>
-      </w:pPr>
-      <w:r>
-        <w:rPr>
-          <w:lang w:val="en-GB"/>
-        </w:rPr>
-        <w:t xml:space="preserve">                 </w:t>
+        </w:rPr>
+        <w:t>MaxFileSize</w:t>
+      </w:r>
+      <w:proofErr w:type="spellEnd"/>
+      <w:r>
+        <w:t>="10485760"</w:t>
+      </w:r>
+    </w:p>
+    <w:p>
+      <w:pPr>
+        <w:spacing w:after="0" w:line="240" w:lineRule="auto"/>
+      </w:pPr>
+      <w:r>
+        <w:t xml:space="preserve">                   </w:t>
       </w:r>
       <w:r>
         <w:rPr>
           <w:b/>
           <w:bCs/>
-          <w:lang w:val="en-GB"/>
-        </w:rPr>
-        <w:t>Clearable</w:t>
-      </w:r>
-      <w:r>
-        <w:rPr>
-          <w:lang w:val="en-GB"/>
-        </w:rPr>
-        <w:t>="true"</w:t>
-      </w:r>
-    </w:p>
-    <w:p>
-      <w:pPr>
-        <w:spacing w:after="0"/>
-        <w:rPr>
-          <w:lang w:val="en-GB"/>
-        </w:rPr>
-      </w:pPr>
-      <w:r>
-        <w:rPr>
-          <w:lang w:val="en-GB"/>
-        </w:rPr>
-        <w:t xml:space="preserve">                 </w:t>
-      </w:r>
+        </w:rPr>
+        <w:t>Disabled</w:t>
+      </w:r>
+      <w:r>
+        <w:t>="@_</w:t>
+      </w:r>
+      <w:proofErr w:type="spellStart"/>
+      <w:r>
+        <w:t>btnProcessing</w:t>
+      </w:r>
+      <w:proofErr w:type="spellEnd"/>
+      <w:r>
+        <w:t>"&gt;</w:t>
+      </w:r>
+    </w:p>
+    <w:p>
+      <w:pPr>
+        <w:spacing w:after="0" w:line="240" w:lineRule="auto"/>
+      </w:pPr>
+    </w:p>
+    <w:p>
+      <w:pPr>
+        <w:spacing w:after="0" w:line="240" w:lineRule="auto"/>
+      </w:pPr>
+      <w:r>
+        <w:t xml:space="preserve">        &lt;</w:t>
+      </w:r>
+      <w:proofErr w:type="spellStart"/>
       <w:r>
         <w:rPr>
           <w:b/>
           <w:bCs/>
-          <w:lang w:val="en-GB"/>
-        </w:rPr>
-        <w:t>Typo</w:t>
-      </w:r>
-      <w:r>
-        <w:rPr>
-          <w:lang w:val="en-GB"/>
-        </w:rPr>
-        <w:t>="Typo.subtitle2"</w:t>
-      </w:r>
-    </w:p>
-    <w:p>
-      <w:pPr>
-        <w:spacing w:after="0"/>
-        <w:rPr>
-          <w:lang w:val="en-GB"/>
-        </w:rPr>
-      </w:pPr>
-      <w:r>
-        <w:rPr>
-          <w:lang w:val="en-GB"/>
-        </w:rPr>
-        <w:t xml:space="preserve">                 </w:t>
-      </w:r>
+        </w:rPr>
+        <w:t>ActivatorContent</w:t>
+      </w:r>
+      <w:proofErr w:type="spellEnd"/>
+      <w:r>
+        <w:t>&gt;</w:t>
+      </w:r>
+    </w:p>
+    <w:p>
+      <w:pPr>
+        <w:spacing w:after="0" w:line="240" w:lineRule="auto"/>
+      </w:pPr>
+      <w:r>
+        <w:t xml:space="preserve">            &lt;</w:t>
+      </w:r>
+      <w:proofErr w:type="spellStart"/>
       <w:r>
         <w:rPr>
           <w:b/>
           <w:bCs/>
-          <w:lang w:val="en-GB"/>
-        </w:rPr>
-        <w:t>Disabled</w:t>
-      </w:r>
-      <w:r>
-        <w:rPr>
-          <w:lang w:val="en-GB"/>
-        </w:rPr>
-        <w:t>="@_isDisabled"</w:t>
-      </w:r>
-    </w:p>
-    <w:p>
-      <w:pPr>
-        <w:spacing w:after="0"/>
-        <w:rPr>
-          <w:lang w:val="en-GB"/>
-        </w:rPr>
-      </w:pPr>
-      <w:r>
-        <w:rPr>
-          <w:lang w:val="en-GB"/>
-        </w:rPr>
-        <w:t xml:space="preserve">                 </w:t>
+        </w:rPr>
+        <w:t>MudButton</w:t>
+      </w:r>
+      <w:proofErr w:type="spellEnd"/>
+      <w:r>
+        <w:t xml:space="preserve"> </w:t>
       </w:r>
       <w:r>
         <w:rPr>
           <w:b/>
           <w:bCs/>
-          <w:lang w:val="en-GB"/>
-        </w:rPr>
-        <w:t>MaxItems</w:t>
-      </w:r>
-      <w:r>
-        <w:rPr>
-          <w:lang w:val="en-GB"/>
-        </w:rPr>
-        <w:t>="@(_leaveModeList != null ? _leaveModeList.Count : 10)"</w:t>
-      </w:r>
-    </w:p>
-    <w:p>
-      <w:pPr>
-        <w:spacing w:after="0"/>
-      </w:pPr>
-      <w:r>
-        <w:rPr>
-          <w:lang w:val="en-GB"/>
-        </w:rPr>
-        <w:t xml:space="preserve">                 </w:t>
-      </w:r>
+        </w:rPr>
+        <w:t>Variant</w:t>
+      </w:r>
+      <w:r>
+        <w:t>="</w:t>
+      </w:r>
+      <w:proofErr w:type="spellStart"/>
+      <w:r>
+        <w:t>Variant.Filled</w:t>
+      </w:r>
+      <w:proofErr w:type="spellEnd"/>
+      <w:r>
+        <w:t>"</w:t>
+      </w:r>
+    </w:p>
+    <w:p>
+      <w:pPr>
+        <w:spacing w:after="0" w:line="240" w:lineRule="auto"/>
+      </w:pPr>
+      <w:r>
+        <w:t xml:space="preserve">                </w:t>
+      </w:r>
+      <w:proofErr w:type="spellStart"/>
       <w:r>
         <w:rPr>
           <w:b/>
           <w:bCs/>
-          <w:lang w:val="en-GB"/>
-        </w:rPr>
-        <w:t>Modal</w:t>
-      </w:r>
-      <w:r>
-        <w:rPr>
-          <w:lang w:val="en-GB"/>
-        </w:rPr>
-        <w:t>="true" /&gt;</w:t>
-      </w:r>
-    </w:p>
-    <w:p>
-      <w:pPr>
-        <w:spacing w:after="0" w:line="240" w:lineRule="auto"/>
-        <w:rPr>
-          <w:lang w:val="en-GB"/>
-        </w:rPr>
-      </w:pPr>
+        </w:rPr>
+        <w:t>EndIcon</w:t>
+      </w:r>
+      <w:proofErr w:type="spellEnd"/>
+      <w:r>
+        <w:t>="@</w:t>
+      </w:r>
+      <w:proofErr w:type="spellStart"/>
+      <w:proofErr w:type="gramStart"/>
+      <w:r>
+        <w:t>Icons.Material.Filled.AttachFile</w:t>
+      </w:r>
+      <w:proofErr w:type="spellEnd"/>
+      <w:proofErr w:type="gramEnd"/>
+      <w:r>
+        <w:t>"</w:t>
+      </w:r>
+    </w:p>
+    <w:p>
+      <w:pPr>
+        <w:spacing w:after="0" w:line="240" w:lineRule="auto"/>
+      </w:pPr>
+      <w:r>
+        <w:t xml:space="preserve">                </w:t>
+      </w:r>
+      <w:r>
+        <w:rPr>
+          <w:b/>
+          <w:bCs/>
+        </w:rPr>
+        <w:t>Size</w:t>
+      </w:r>
+      <w:r>
+        <w:t>="</w:t>
+      </w:r>
+      <w:proofErr w:type="spellStart"/>
+      <w:r>
+        <w:t>Size.Small</w:t>
+      </w:r>
+      <w:proofErr w:type="spellEnd"/>
+      <w:r>
+        <w:t>"</w:t>
+      </w:r>
+    </w:p>
+    <w:p>
+      <w:pPr>
+        <w:spacing w:after="0" w:line="240" w:lineRule="auto"/>
+      </w:pPr>
+      <w:r>
+        <w:t xml:space="preserve">                       </w:t>
+      </w:r>
+      <w:r>
+        <w:rPr>
+          <w:b/>
+          <w:bCs/>
+        </w:rPr>
+        <w:t>Color</w:t>
+      </w:r>
+      <w:r>
+        <w:t>="</w:t>
+      </w:r>
+      <w:proofErr w:type="spellStart"/>
+      <w:r>
+        <w:t>Color.Info</w:t>
+      </w:r>
+      <w:proofErr w:type="spellEnd"/>
+      <w:r>
+        <w:t>"&gt;</w:t>
+      </w:r>
+    </w:p>
+    <w:p>
+      <w:pPr>
+        <w:spacing w:after="0" w:line="240" w:lineRule="auto"/>
+      </w:pPr>
+      <w:r>
+        <w:t xml:space="preserve">                Upload Files</w:t>
+      </w:r>
+    </w:p>
+    <w:p>
+      <w:pPr>
+        <w:spacing w:after="0" w:line="240" w:lineRule="auto"/>
+      </w:pPr>
+      <w:r>
+        <w:t xml:space="preserve">            &lt;/</w:t>
+      </w:r>
+      <w:proofErr w:type="spellStart"/>
+      <w:r>
+        <w:rPr>
+          <w:b/>
+          <w:bCs/>
+        </w:rPr>
+        <w:t>MudButton</w:t>
+      </w:r>
+      <w:proofErr w:type="spellEnd"/>
+      <w:r>
+        <w:t>&gt;</w:t>
+      </w:r>
+    </w:p>
+    <w:p>
+      <w:pPr>
+        <w:spacing w:after="0" w:line="240" w:lineRule="auto"/>
+      </w:pPr>
+      <w:r>
+        <w:t xml:space="preserve">        &lt;/</w:t>
+      </w:r>
+      <w:proofErr w:type="spellStart"/>
+      <w:r>
+        <w:rPr>
+          <w:b/>
+          <w:bCs/>
+        </w:rPr>
+        <w:t>ActivatorContent</w:t>
+      </w:r>
+      <w:proofErr w:type="spellEnd"/>
+      <w:r>
+        <w:t>&gt;</w:t>
+      </w:r>
+    </w:p>
+    <w:p>
+      <w:pPr>
+        <w:spacing w:after="0" w:line="240" w:lineRule="auto"/>
+      </w:pPr>
+    </w:p>
+    <w:p>
+      <w:pPr>
+        <w:spacing w:after="0" w:line="240" w:lineRule="auto"/>
+      </w:pPr>
+      <w:r>
+        <w:t xml:space="preserve">    &lt;/</w:t>
+      </w:r>
+      <w:proofErr w:type="spellStart"/>
+      <w:r>
+        <w:rPr>
+          <w:b/>
+          <w:bCs/>
+        </w:rPr>
+        <w:t>MudFileUpload</w:t>
+      </w:r>
+      <w:proofErr w:type="spellEnd"/>
+      <w:r>
+        <w:t>&gt;</w:t>
+      </w:r>
+    </w:p>
+    <w:p>
+      <w:pPr>
+        <w:spacing w:after="0" w:line="240" w:lineRule="auto"/>
+      </w:pPr>
+    </w:p>
+    <w:p>
+      <w:pPr>
+        <w:spacing w:after="0" w:line="240" w:lineRule="auto"/>
+      </w:pPr>
+      <w:r>
+        <w:t xml:space="preserve">    @if (_</w:t>
+      </w:r>
+      <w:proofErr w:type="spellStart"/>
+      <w:proofErr w:type="gramStart"/>
+      <w:r>
+        <w:t>files?.Any</w:t>
+      </w:r>
+      <w:proofErr w:type="spellEnd"/>
+      <w:r>
+        <w:t>(</w:t>
+      </w:r>
+      <w:proofErr w:type="gramEnd"/>
+      <w:r>
+        <w:t>) == true)</w:t>
+      </w:r>
+    </w:p>
+    <w:p>
+      <w:pPr>
+        <w:spacing w:after="0" w:line="240" w:lineRule="auto"/>
+      </w:pPr>
+      <w:r>
+        <w:t xml:space="preserve">    {</w:t>
+      </w:r>
+    </w:p>
+    <w:p>
+      <w:pPr>
+        <w:spacing w:after="0" w:line="240" w:lineRule="auto"/>
+      </w:pPr>
+      <w:r>
+        <w:t xml:space="preserve">        &lt;</w:t>
+      </w:r>
+      <w:proofErr w:type="spellStart"/>
+      <w:r>
+        <w:rPr>
+          <w:b/>
+          <w:bCs/>
+        </w:rPr>
+        <w:t>MudChipSet</w:t>
+      </w:r>
+      <w:proofErr w:type="spellEnd"/>
+      <w:r>
+        <w:t xml:space="preserve"> </w:t>
+      </w:r>
+      <w:r>
+        <w:rPr>
+          <w:b/>
+          <w:bCs/>
+        </w:rPr>
+        <w:t>T</w:t>
+      </w:r>
+      <w:r>
+        <w:t>="</w:t>
+      </w:r>
+      <w:proofErr w:type="spellStart"/>
+      <w:r>
+        <w:t>IBrowserFile</w:t>
+      </w:r>
+      <w:proofErr w:type="spellEnd"/>
+      <w:r>
+        <w:t xml:space="preserve">" </w:t>
+      </w:r>
+      <w:r>
+        <w:rPr>
+          <w:b/>
+          <w:bCs/>
+        </w:rPr>
+        <w:t>Class</w:t>
+      </w:r>
+      <w:r>
+        <w:t>="mt-2"&gt;</w:t>
+      </w:r>
+    </w:p>
+    <w:p>
+      <w:pPr>
+        <w:spacing w:after="0" w:line="240" w:lineRule="auto"/>
+      </w:pPr>
+      <w:r>
+        <w:t xml:space="preserve">            @foreach (var file in _files)</w:t>
+      </w:r>
+    </w:p>
+    <w:p>
+      <w:pPr>
+        <w:spacing w:after="0" w:line="240" w:lineRule="auto"/>
+      </w:pPr>
+      <w:r>
+        <w:t xml:space="preserve">            {</w:t>
+      </w:r>
+    </w:p>
+    <w:p>
+      <w:pPr>
+        <w:spacing w:after="0" w:line="240" w:lineRule="auto"/>
+      </w:pPr>
+      <w:r>
+        <w:t xml:space="preserve">                &lt;</w:t>
+      </w:r>
+      <w:proofErr w:type="spellStart"/>
+      <w:r>
+        <w:rPr>
+          <w:b/>
+          <w:bCs/>
+        </w:rPr>
+        <w:t>MudChip</w:t>
+      </w:r>
+      <w:proofErr w:type="spellEnd"/>
+      <w:r>
+        <w:t xml:space="preserve"> </w:t>
+      </w:r>
+      <w:r>
+        <w:rPr>
+          <w:b/>
+          <w:bCs/>
+        </w:rPr>
+        <w:t>T</w:t>
+      </w:r>
+      <w:r>
+        <w:t>="</w:t>
+      </w:r>
+      <w:proofErr w:type="spellStart"/>
+      <w:r>
+        <w:t>IBrowserFile</w:t>
+      </w:r>
+      <w:proofErr w:type="spellEnd"/>
+      <w:r>
+        <w:t>"</w:t>
+      </w:r>
+    </w:p>
+    <w:p>
+      <w:pPr>
+        <w:spacing w:after="0" w:line="240" w:lineRule="auto"/>
+      </w:pPr>
+      <w:r>
+        <w:t xml:space="preserve">                         </w:t>
+      </w:r>
+      <w:r>
+        <w:rPr>
+          <w:b/>
+          <w:bCs/>
+        </w:rPr>
+        <w:t>Color</w:t>
+      </w:r>
+      <w:r>
+        <w:t>="</w:t>
+      </w:r>
+      <w:proofErr w:type="spellStart"/>
+      <w:r>
+        <w:t>Color.Info</w:t>
+      </w:r>
+      <w:proofErr w:type="spellEnd"/>
+      <w:r>
+        <w:t>"</w:t>
+      </w:r>
+    </w:p>
+    <w:p>
+      <w:pPr>
+        <w:spacing w:after="0" w:line="240" w:lineRule="auto"/>
+      </w:pPr>
+      <w:r>
+        <w:t xml:space="preserve">                         </w:t>
+      </w:r>
+      <w:r>
+        <w:rPr>
+          <w:b/>
+          <w:bCs/>
+        </w:rPr>
+        <w:t>Variant</w:t>
+      </w:r>
+      <w:r>
+        <w:t>="</w:t>
+      </w:r>
+      <w:proofErr w:type="spellStart"/>
+      <w:r>
+        <w:t>Variant.Outlined</w:t>
+      </w:r>
+      <w:proofErr w:type="spellEnd"/>
+      <w:r>
+        <w:t>"</w:t>
+      </w:r>
+    </w:p>
+    <w:p>
+      <w:pPr>
+        <w:spacing w:after="0" w:line="240" w:lineRule="auto"/>
+      </w:pPr>
+      <w:r>
+        <w:t xml:space="preserve">                         Closeable="true"</w:t>
+      </w:r>
+    </w:p>
+    <w:p>
+      <w:pPr>
+        <w:spacing w:after="0" w:line="240" w:lineRule="auto"/>
+      </w:pPr>
+      <w:r>
+        <w:t xml:space="preserve">                         </w:t>
+      </w:r>
+      <w:r>
+        <w:rPr>
+          <w:b/>
+          <w:bCs/>
+        </w:rPr>
+        <w:t>Disabled</w:t>
+      </w:r>
+      <w:r>
+        <w:t>="@_</w:t>
+      </w:r>
+      <w:proofErr w:type="spellStart"/>
+      <w:r>
+        <w:t>btnProcessing</w:t>
+      </w:r>
+      <w:proofErr w:type="spellEnd"/>
+      <w:r>
+        <w:t>"</w:t>
+      </w:r>
+    </w:p>
+    <w:p>
+      <w:pPr>
+        <w:spacing w:after="0" w:line="240" w:lineRule="auto"/>
+      </w:pPr>
+      <w:r>
+        <w:t xml:space="preserve">                         </w:t>
+      </w:r>
+      <w:proofErr w:type="spellStart"/>
+      <w:r>
+        <w:rPr>
+          <w:b/>
+          <w:bCs/>
+        </w:rPr>
+        <w:t>OnClose</w:t>
+      </w:r>
+      <w:proofErr w:type="spellEnd"/>
+      <w:r>
+        <w:t>="</w:t>
+      </w:r>
+      <w:proofErr w:type="gramStart"/>
+      <w:r>
+        <w:t>@(</w:t>
+      </w:r>
+      <w:proofErr w:type="gramEnd"/>
+      <w:r>
+        <w:t xml:space="preserve">() =&gt; </w:t>
+      </w:r>
+      <w:proofErr w:type="spellStart"/>
+      <w:r>
+        <w:t>RemoveFile</w:t>
+      </w:r>
+      <w:proofErr w:type="spellEnd"/>
+      <w:r>
+        <w:t>(file))"&gt;</w:t>
+      </w:r>
+    </w:p>
+    <w:p>
+      <w:pPr>
+        <w:spacing w:after="0" w:line="240" w:lineRule="auto"/>
+      </w:pPr>
+      <w:r>
+        <w:t xml:space="preserve">                    @</w:t>
+      </w:r>
+      <w:proofErr w:type="gramStart"/>
+      <w:r>
+        <w:t>file.Name</w:t>
+      </w:r>
+      <w:proofErr w:type="gramEnd"/>
+      <w:r>
+        <w:t xml:space="preserve"> (</w:t>
+      </w:r>
+      <w:proofErr w:type="gramStart"/>
+      <w:r>
+        <w:t>@(file.Size</w:t>
+      </w:r>
+      <w:proofErr w:type="gramEnd"/>
+      <w:r>
+        <w:t xml:space="preserve"> / 1024) KB)</w:t>
+      </w:r>
+    </w:p>
+    <w:p>
+      <w:pPr>
+        <w:spacing w:after="0" w:line="240" w:lineRule="auto"/>
+      </w:pPr>
+      <w:r>
+        <w:t xml:space="preserve">                &lt;/</w:t>
+      </w:r>
+      <w:proofErr w:type="spellStart"/>
+      <w:r>
+        <w:rPr>
+          <w:b/>
+          <w:bCs/>
+        </w:rPr>
+        <w:t>MudChip</w:t>
+      </w:r>
+      <w:proofErr w:type="spellEnd"/>
+      <w:r>
+        <w:t>&gt;</w:t>
+      </w:r>
+    </w:p>
+    <w:p>
+      <w:pPr>
+        <w:spacing w:after="0" w:line="240" w:lineRule="auto"/>
+      </w:pPr>
+      <w:r>
+        <w:t xml:space="preserve">            }</w:t>
+      </w:r>
+    </w:p>
+    <w:p>
+      <w:pPr>
+        <w:spacing w:after="0" w:line="240" w:lineRule="auto"/>
+      </w:pPr>
+      <w:r>
+        <w:t xml:space="preserve">        &lt;/</w:t>
+      </w:r>
+      <w:proofErr w:type="spellStart"/>
+      <w:r>
+        <w:rPr>
+          <w:b/>
+          <w:bCs/>
+        </w:rPr>
+        <w:t>MudChipSet</w:t>
+      </w:r>
+      <w:proofErr w:type="spellEnd"/>
+      <w:r>
+        <w:t>&gt;</w:t>
+      </w:r>
+    </w:p>
+    <w:p>
+      <w:pPr>
+        <w:spacing w:after="0" w:line="240" w:lineRule="auto"/>
+      </w:pPr>
+      <w:r>
+        <w:t xml:space="preserve">    }</w:t>
+      </w:r>
+    </w:p>
+    <w:p>
+      <w:pPr>
+        <w:spacing w:after="0" w:line="240" w:lineRule="auto"/>
+      </w:pPr>
+      <w:r>
+        <w:t>&lt;/</w:t>
+      </w:r>
+      <w:proofErr w:type="spellStart"/>
+      <w:r>
+        <w:rPr>
+          <w:b/>
+          <w:bCs/>
+        </w:rPr>
+        <w:t>MudStack</w:t>
+      </w:r>
+      <w:proofErr w:type="spellEnd"/>
+      <w:r>
+        <w:t>&gt;</w:t>
+      </w:r>
+    </w:p>
+    <w:p>
+      <w:pPr>
+        <w:spacing w:after="0" w:line="240" w:lineRule="auto"/>
+      </w:pPr>
+    </w:p>
+    <w:p>
+      <w:pPr>
+        <w:spacing w:after="0" w:line="240" w:lineRule="auto"/>
+      </w:pPr>
+      <w:r>
+        <w:rPr>
+          <w:lang w:val="en-GB"/>
+        </w:rPr>
+        <w:t xml:space="preserve">The following error occurred. </w:t>
+      </w:r>
+      <w:r>
+        <w:rPr>
+          <w:lang w:val="en-GB"/>
+        </w:rPr>
+        <w:t xml:space="preserve">Note that I am using .NET 8.0 and </w:t>
+      </w:r>
+      <w:proofErr w:type="spellStart"/>
+      <w:r>
+        <w:rPr>
+          <w:lang w:val="en-GB"/>
+        </w:rPr>
+        <w:t>MudBlazor</w:t>
+      </w:r>
+      <w:proofErr w:type="spellEnd"/>
+      <w:r>
+        <w:rPr>
+          <w:lang w:val="en-GB"/>
+        </w:rPr>
+        <w:t xml:space="preserve"> ver. 8.8.0. Provide production-ready complete code for the domain model, business logic, and UI code-behind.</w:t>
+      </w:r>
+    </w:p>
+    <w:p>
+      <w:pPr>
+        <w:spacing w:after="0" w:line="240" w:lineRule="auto"/>
+      </w:pPr>
+    </w:p>
+    <w:p>
+      <w:pPr>
+        <w:spacing w:after="0" w:line="240" w:lineRule="auto"/>
+      </w:pPr>
+      <w:r>
+        <w:t>Error:</w:t>
+      </w:r>
+    </w:p>
+    <w:p>
+      <w:pPr>
+        <w:spacing w:after="0" w:line="240" w:lineRule="auto"/>
+      </w:pPr>
+      <w:r>
+        <w:t xml:space="preserve">Argument 2: Cannot convert from ‘method group’ to </w:t>
+      </w:r>
+      <w:proofErr w:type="spellStart"/>
+      <w:proofErr w:type="gramStart"/>
+      <w:r>
+        <w:t>Microsoft.AspNetCore.Components.EventCallback</w:t>
+      </w:r>
+      <w:proofErr w:type="spellEnd"/>
+      <w:proofErr w:type="gramEnd"/>
+    </w:p>
+    <w:p>
+      <w:pPr>
+        <w:spacing w:after="0" w:line="240" w:lineRule="auto"/>
+      </w:pPr>
+    </w:p>
+    <w:p>
+      <w:pPr>
+        <w:spacing w:after="0" w:line="240" w:lineRule="auto"/>
+        <w:rPr>
+          <w:b/>
+          <w:bCs/>
+          <w:color w:val="EE0000"/>
+          <w:u w:val="single"/>
+        </w:rPr>
+      </w:pPr>
+      <w:r>
+        <w:rPr>
+          <w:b/>
+          <w:bCs/>
+          <w:color w:val="EE0000"/>
+          <w:u w:val="single"/>
+        </w:rPr>
+        <w:t>Prompt 3:</w:t>
+      </w:r>
+    </w:p>
+    <w:p>
+      <w:pPr>
+        <w:spacing w:after="0" w:line="240" w:lineRule="auto"/>
+      </w:pPr>
+    </w:p>
+    <w:p>
+      <w:pPr>
+        <w:spacing w:after="0" w:line="240" w:lineRule="auto"/>
+      </w:pPr>
+      <w:r>
+        <w:t>Below is the C# code-behind for saving the leave request to the database as well as the “</w:t>
+      </w:r>
+      <w:proofErr w:type="spellStart"/>
+      <w:r>
+        <w:t>LeaveRequisitionWF</w:t>
+      </w:r>
+      <w:proofErr w:type="spellEnd"/>
+      <w:r>
+        <w:t xml:space="preserve">” domain entity class. </w:t>
+      </w:r>
+      <w:r>
+        <w:rPr>
+          <w:lang w:val="en-GB"/>
+        </w:rPr>
+        <w:t xml:space="preserve">Refactor the </w:t>
+      </w:r>
+      <w:proofErr w:type="spellStart"/>
+      <w:proofErr w:type="gramStart"/>
+      <w:r>
+        <w:t>AddLeaveRequestAsync</w:t>
+      </w:r>
+      <w:proofErr w:type="spellEnd"/>
+      <w:r>
+        <w:t>(</w:t>
+      </w:r>
+      <w:proofErr w:type="gramEnd"/>
+      <w:r>
+        <w:t>) method to get the value of “</w:t>
+      </w:r>
+      <w:proofErr w:type="spellStart"/>
+      <w:r>
+        <w:t>LeaveRequestId</w:t>
+      </w:r>
+      <w:proofErr w:type="spellEnd"/>
+      <w:r>
+        <w:t>” identity field after saving to the database.</w:t>
+      </w:r>
+    </w:p>
+    <w:p>
+      <w:pPr>
+        <w:spacing w:after="0" w:line="240" w:lineRule="auto"/>
+      </w:pPr>
+    </w:p>
+    <w:p>
+      <w:pPr>
+        <w:spacing w:after="0" w:line="240" w:lineRule="auto"/>
+      </w:pPr>
+      <w:r>
+        <w:t xml:space="preserve">public async Task&lt;Result&lt;int&gt;&gt; </w:t>
+      </w:r>
+      <w:proofErr w:type="spellStart"/>
+      <w:proofErr w:type="gramStart"/>
+      <w:r>
+        <w:t>AddLeaveRequestAsync</w:t>
+      </w:r>
+      <w:proofErr w:type="spellEnd"/>
+      <w:r>
+        <w:t>(</w:t>
+      </w:r>
+      <w:proofErr w:type="spellStart"/>
+      <w:proofErr w:type="gramEnd"/>
+      <w:r>
+        <w:t>LeaveRequisitionWF</w:t>
+      </w:r>
+      <w:proofErr w:type="spellEnd"/>
+      <w:r>
+        <w:t xml:space="preserve"> </w:t>
+      </w:r>
+      <w:proofErr w:type="spellStart"/>
+      <w:r>
+        <w:t>dto</w:t>
+      </w:r>
+      <w:proofErr w:type="spellEnd"/>
+      <w:r>
+        <w:t xml:space="preserve">, </w:t>
+      </w:r>
+      <w:proofErr w:type="spellStart"/>
+      <w:r>
+        <w:t>CancellationToken</w:t>
+      </w:r>
+      <w:proofErr w:type="spellEnd"/>
+      <w:r>
+        <w:t xml:space="preserve"> </w:t>
+      </w:r>
+      <w:proofErr w:type="spellStart"/>
+      <w:r>
+        <w:t>cancellationToken</w:t>
+      </w:r>
+      <w:proofErr w:type="spellEnd"/>
+      <w:r>
+        <w:t>)</w:t>
+      </w:r>
+    </w:p>
+    <w:p>
+      <w:pPr>
+        <w:spacing w:after="0" w:line="240" w:lineRule="auto"/>
+      </w:pPr>
+      <w:r>
+        <w:t>{</w:t>
+      </w:r>
+    </w:p>
+    <w:p>
+      <w:pPr>
+        <w:spacing w:after="0" w:line="240" w:lineRule="auto"/>
+      </w:pPr>
+      <w:r>
+        <w:t xml:space="preserve">    int </w:t>
+      </w:r>
+      <w:proofErr w:type="spellStart"/>
+      <w:r>
+        <w:t>rowsInserted</w:t>
+      </w:r>
+      <w:proofErr w:type="spellEnd"/>
+      <w:r>
+        <w:t xml:space="preserve"> = 0;</w:t>
+      </w:r>
+    </w:p>
+    <w:p>
+      <w:pPr>
+        <w:spacing w:after="0" w:line="240" w:lineRule="auto"/>
+      </w:pPr>
+    </w:p>
+    <w:p>
+      <w:pPr>
+        <w:spacing w:after="0" w:line="240" w:lineRule="auto"/>
+      </w:pPr>
+      <w:r>
+        <w:t xml:space="preserve">    try</w:t>
+      </w:r>
+    </w:p>
+    <w:p>
+      <w:pPr>
+        <w:spacing w:after="0" w:line="240" w:lineRule="auto"/>
+      </w:pPr>
+      <w:r>
+        <w:t xml:space="preserve">    {</w:t>
+      </w:r>
+    </w:p>
+    <w:p>
+      <w:pPr>
+        <w:spacing w:after="0" w:line="240" w:lineRule="auto"/>
+      </w:pPr>
+      <w:r>
+        <w:t xml:space="preserve">        if (</w:t>
+      </w:r>
+      <w:proofErr w:type="spellStart"/>
+      <w:r>
+        <w:t>dto</w:t>
+      </w:r>
+      <w:proofErr w:type="spellEnd"/>
+      <w:r>
+        <w:t xml:space="preserve"> is null)</w:t>
+      </w:r>
+    </w:p>
+    <w:p>
+      <w:pPr>
+        <w:spacing w:after="0" w:line="240" w:lineRule="auto"/>
+      </w:pPr>
+      <w:r>
+        <w:t xml:space="preserve">            throw new </w:t>
+      </w:r>
+      <w:proofErr w:type="spellStart"/>
+      <w:r>
+        <w:t>ArgumentNullException</w:t>
+      </w:r>
+      <w:proofErr w:type="spellEnd"/>
+      <w:r>
+        <w:t>(</w:t>
+      </w:r>
+      <w:proofErr w:type="spellStart"/>
+      <w:r>
+        <w:t>nameof</w:t>
+      </w:r>
+      <w:proofErr w:type="spellEnd"/>
+      <w:r>
+        <w:t>(</w:t>
+      </w:r>
+      <w:proofErr w:type="spellStart"/>
+      <w:r>
+        <w:t>dto</w:t>
+      </w:r>
+      <w:proofErr w:type="spellEnd"/>
+      <w:r>
+        <w:t>));</w:t>
+      </w:r>
+    </w:p>
+    <w:p>
+      <w:pPr>
+        <w:spacing w:after="0" w:line="240" w:lineRule="auto"/>
+      </w:pPr>
+    </w:p>
+    <w:p>
+      <w:pPr>
+        <w:spacing w:after="0" w:line="240" w:lineRule="auto"/>
+      </w:pPr>
+      <w:r>
+        <w:t xml:space="preserve">        #region Initialize entity</w:t>
+      </w:r>
+    </w:p>
+    <w:p>
+      <w:pPr>
+        <w:spacing w:after="0" w:line="240" w:lineRule="auto"/>
+      </w:pPr>
+      <w:r>
+        <w:t xml:space="preserve">        var </w:t>
+      </w:r>
+      <w:proofErr w:type="spellStart"/>
+      <w:r>
+        <w:t>leaveRequest</w:t>
+      </w:r>
+      <w:proofErr w:type="spellEnd"/>
+      <w:r>
+        <w:t xml:space="preserve"> = new </w:t>
+      </w:r>
+      <w:proofErr w:type="spellStart"/>
+      <w:r>
+        <w:t>LeaveRequisitionWF</w:t>
+      </w:r>
+      <w:proofErr w:type="spellEnd"/>
+    </w:p>
+    <w:p>
+      <w:pPr>
+        <w:spacing w:after="0" w:line="240" w:lineRule="auto"/>
+      </w:pPr>
+      <w:r>
+        <w:t xml:space="preserve">        {</w:t>
+      </w:r>
+    </w:p>
+    <w:p>
+      <w:pPr>
+        <w:spacing w:after="0" w:line="240" w:lineRule="auto"/>
+      </w:pPr>
+      <w:r>
+        <w:lastRenderedPageBreak/>
+        <w:t xml:space="preserve">            </w:t>
+      </w:r>
+      <w:proofErr w:type="spellStart"/>
+      <w:r>
+        <w:t>LeaveType</w:t>
+      </w:r>
+      <w:proofErr w:type="spellEnd"/>
+      <w:r>
+        <w:t xml:space="preserve"> = </w:t>
+      </w:r>
+      <w:proofErr w:type="spellStart"/>
+      <w:proofErr w:type="gramStart"/>
+      <w:r>
+        <w:t>dto.LeaveType</w:t>
+      </w:r>
+      <w:proofErr w:type="spellEnd"/>
+      <w:proofErr w:type="gramEnd"/>
+      <w:r>
+        <w:t>,</w:t>
+      </w:r>
+    </w:p>
+    <w:p>
+      <w:pPr>
+        <w:spacing w:after="0" w:line="240" w:lineRule="auto"/>
+      </w:pPr>
+      <w:r>
+        <w:t xml:space="preserve">            </w:t>
+      </w:r>
+      <w:proofErr w:type="spellStart"/>
+      <w:r>
+        <w:t>LeaveEmpNo</w:t>
+      </w:r>
+      <w:proofErr w:type="spellEnd"/>
+      <w:r>
+        <w:t xml:space="preserve"> = </w:t>
+      </w:r>
+      <w:proofErr w:type="spellStart"/>
+      <w:proofErr w:type="gramStart"/>
+      <w:r>
+        <w:t>dto.LeaveEmpNo</w:t>
+      </w:r>
+      <w:proofErr w:type="spellEnd"/>
+      <w:proofErr w:type="gramEnd"/>
+      <w:r>
+        <w:t>,</w:t>
+      </w:r>
+    </w:p>
+    <w:p>
+      <w:pPr>
+        <w:spacing w:after="0" w:line="240" w:lineRule="auto"/>
+      </w:pPr>
+      <w:r>
+        <w:t xml:space="preserve">            </w:t>
+      </w:r>
+      <w:proofErr w:type="spellStart"/>
+      <w:r>
+        <w:t>LeaveEmpName</w:t>
+      </w:r>
+      <w:proofErr w:type="spellEnd"/>
+      <w:r>
+        <w:t xml:space="preserve"> = </w:t>
+      </w:r>
+      <w:proofErr w:type="spellStart"/>
+      <w:proofErr w:type="gramStart"/>
+      <w:r>
+        <w:t>dto.LeaveEmpName</w:t>
+      </w:r>
+      <w:proofErr w:type="spellEnd"/>
+      <w:proofErr w:type="gramEnd"/>
+      <w:r>
+        <w:t>,</w:t>
+      </w:r>
+    </w:p>
+    <w:p>
+      <w:pPr>
+        <w:spacing w:after="0" w:line="240" w:lineRule="auto"/>
+      </w:pPr>
+      <w:r>
+        <w:t xml:space="preserve">            </w:t>
+      </w:r>
+      <w:proofErr w:type="spellStart"/>
+      <w:r>
+        <w:t>LeaveEmpEmail</w:t>
+      </w:r>
+      <w:proofErr w:type="spellEnd"/>
+      <w:r>
+        <w:t xml:space="preserve"> = </w:t>
+      </w:r>
+      <w:proofErr w:type="spellStart"/>
+      <w:proofErr w:type="gramStart"/>
+      <w:r>
+        <w:t>dto.LeaveEmpEmail</w:t>
+      </w:r>
+      <w:proofErr w:type="spellEnd"/>
+      <w:proofErr w:type="gramEnd"/>
+      <w:r>
+        <w:t>,</w:t>
+      </w:r>
+    </w:p>
+    <w:p>
+      <w:pPr>
+        <w:spacing w:after="0" w:line="240" w:lineRule="auto"/>
+      </w:pPr>
+      <w:r>
+        <w:t xml:space="preserve">            </w:t>
+      </w:r>
+      <w:proofErr w:type="spellStart"/>
+      <w:r>
+        <w:t>LeaveEmpCostCenter</w:t>
+      </w:r>
+      <w:proofErr w:type="spellEnd"/>
+      <w:r>
+        <w:t xml:space="preserve"> = </w:t>
+      </w:r>
+      <w:proofErr w:type="spellStart"/>
+      <w:proofErr w:type="gramStart"/>
+      <w:r>
+        <w:t>dto.LeaveEmpCostCenter</w:t>
+      </w:r>
+      <w:proofErr w:type="spellEnd"/>
+      <w:proofErr w:type="gramEnd"/>
+      <w:r>
+        <w:t>,</w:t>
+      </w:r>
+    </w:p>
+    <w:p>
+      <w:pPr>
+        <w:spacing w:after="0" w:line="240" w:lineRule="auto"/>
+      </w:pPr>
+      <w:r>
+        <w:t xml:space="preserve">            </w:t>
+      </w:r>
+      <w:proofErr w:type="spellStart"/>
+      <w:r>
+        <w:t>LeaveStartDate</w:t>
+      </w:r>
+      <w:proofErr w:type="spellEnd"/>
+      <w:r>
+        <w:t xml:space="preserve"> = </w:t>
+      </w:r>
+      <w:proofErr w:type="spellStart"/>
+      <w:r>
+        <w:t>Convert.ToDateTime</w:t>
+      </w:r>
+      <w:proofErr w:type="spellEnd"/>
+      <w:r>
+        <w:t>(</w:t>
+      </w:r>
+      <w:proofErr w:type="spellStart"/>
+      <w:proofErr w:type="gramStart"/>
+      <w:r>
+        <w:t>dto.LeaveStartDate</w:t>
+      </w:r>
+      <w:proofErr w:type="spellEnd"/>
+      <w:proofErr w:type="gramEnd"/>
+      <w:r>
+        <w:t>),</w:t>
+      </w:r>
+    </w:p>
+    <w:p>
+      <w:pPr>
+        <w:spacing w:after="0" w:line="240" w:lineRule="auto"/>
+      </w:pPr>
+      <w:r>
+        <w:t xml:space="preserve">            </w:t>
+      </w:r>
+      <w:proofErr w:type="spellStart"/>
+      <w:r>
+        <w:t>LeaveEndDate</w:t>
+      </w:r>
+      <w:proofErr w:type="spellEnd"/>
+      <w:r>
+        <w:t xml:space="preserve"> = </w:t>
+      </w:r>
+      <w:proofErr w:type="spellStart"/>
+      <w:r>
+        <w:t>Convert.ToDateTime</w:t>
+      </w:r>
+      <w:proofErr w:type="spellEnd"/>
+      <w:r>
+        <w:t>(</w:t>
+      </w:r>
+      <w:proofErr w:type="spellStart"/>
+      <w:proofErr w:type="gramStart"/>
+      <w:r>
+        <w:t>dto.LeaveEndDate</w:t>
+      </w:r>
+      <w:proofErr w:type="spellEnd"/>
+      <w:proofErr w:type="gramEnd"/>
+      <w:r>
+        <w:t>),</w:t>
+      </w:r>
+    </w:p>
+    <w:p>
+      <w:pPr>
+        <w:spacing w:after="0" w:line="240" w:lineRule="auto"/>
+      </w:pPr>
+      <w:r>
+        <w:t xml:space="preserve">            </w:t>
+      </w:r>
+      <w:proofErr w:type="spellStart"/>
+      <w:r>
+        <w:t>LeaveResumeDate</w:t>
+      </w:r>
+      <w:proofErr w:type="spellEnd"/>
+      <w:r>
+        <w:t xml:space="preserve"> = </w:t>
+      </w:r>
+      <w:proofErr w:type="spellStart"/>
+      <w:r>
+        <w:t>Convert.ToDateTime</w:t>
+      </w:r>
+      <w:proofErr w:type="spellEnd"/>
+      <w:r>
+        <w:t>(</w:t>
+      </w:r>
+      <w:proofErr w:type="spellStart"/>
+      <w:proofErr w:type="gramStart"/>
+      <w:r>
+        <w:t>dto.LeaveResumeDate</w:t>
+      </w:r>
+      <w:proofErr w:type="spellEnd"/>
+      <w:proofErr w:type="gramEnd"/>
+      <w:r>
+        <w:t>),</w:t>
+      </w:r>
+    </w:p>
+    <w:p>
+      <w:pPr>
+        <w:spacing w:after="0" w:line="240" w:lineRule="auto"/>
+      </w:pPr>
+      <w:r>
+        <w:t xml:space="preserve">            </w:t>
+      </w:r>
+      <w:proofErr w:type="spellStart"/>
+      <w:r>
+        <w:t>StartDayMode</w:t>
+      </w:r>
+      <w:proofErr w:type="spellEnd"/>
+      <w:r>
+        <w:t xml:space="preserve"> = </w:t>
+      </w:r>
+      <w:proofErr w:type="spellStart"/>
+      <w:proofErr w:type="gramStart"/>
+      <w:r>
+        <w:t>dto.StartDayMode</w:t>
+      </w:r>
+      <w:proofErr w:type="spellEnd"/>
+      <w:proofErr w:type="gramEnd"/>
+      <w:r>
+        <w:t>,</w:t>
+      </w:r>
+    </w:p>
+    <w:p>
+      <w:pPr>
+        <w:spacing w:after="0" w:line="240" w:lineRule="auto"/>
+      </w:pPr>
+      <w:r>
+        <w:t xml:space="preserve">            </w:t>
+      </w:r>
+      <w:proofErr w:type="spellStart"/>
+      <w:r>
+        <w:t>EndDayMode</w:t>
+      </w:r>
+      <w:proofErr w:type="spellEnd"/>
+      <w:r>
+        <w:t xml:space="preserve"> = </w:t>
+      </w:r>
+      <w:proofErr w:type="spellStart"/>
+      <w:proofErr w:type="gramStart"/>
+      <w:r>
+        <w:t>dto.EndDayMode</w:t>
+      </w:r>
+      <w:proofErr w:type="spellEnd"/>
+      <w:proofErr w:type="gramEnd"/>
+      <w:r>
+        <w:t>,</w:t>
+      </w:r>
+    </w:p>
+    <w:p>
+      <w:pPr>
+        <w:spacing w:after="0" w:line="240" w:lineRule="auto"/>
+      </w:pPr>
+      <w:r>
+        <w:t xml:space="preserve">            </w:t>
+      </w:r>
+      <w:proofErr w:type="spellStart"/>
+      <w:r>
+        <w:t>LeaveBalance</w:t>
+      </w:r>
+      <w:proofErr w:type="spellEnd"/>
+      <w:r>
+        <w:t xml:space="preserve"> = </w:t>
+      </w:r>
+      <w:proofErr w:type="spellStart"/>
+      <w:proofErr w:type="gramStart"/>
+      <w:r>
+        <w:t>dto.LeaveBalance</w:t>
+      </w:r>
+      <w:proofErr w:type="spellEnd"/>
+      <w:proofErr w:type="gramEnd"/>
+      <w:r>
+        <w:t>,</w:t>
+      </w:r>
+    </w:p>
+    <w:p>
+      <w:pPr>
+        <w:spacing w:after="0" w:line="240" w:lineRule="auto"/>
+      </w:pPr>
+      <w:r>
+        <w:t xml:space="preserve">            </w:t>
+      </w:r>
+      <w:proofErr w:type="spellStart"/>
+      <w:r>
+        <w:t>LeaveDuration</w:t>
+      </w:r>
+      <w:proofErr w:type="spellEnd"/>
+      <w:r>
+        <w:t xml:space="preserve"> = </w:t>
+      </w:r>
+      <w:proofErr w:type="spellStart"/>
+      <w:proofErr w:type="gramStart"/>
+      <w:r>
+        <w:t>dto.LeaveDuration</w:t>
+      </w:r>
+      <w:proofErr w:type="spellEnd"/>
+      <w:proofErr w:type="gramEnd"/>
+      <w:r>
+        <w:t>,</w:t>
+      </w:r>
+    </w:p>
+    <w:p>
+      <w:pPr>
+        <w:spacing w:after="0" w:line="240" w:lineRule="auto"/>
+      </w:pPr>
+      <w:r>
+        <w:t xml:space="preserve">            </w:t>
+      </w:r>
+      <w:proofErr w:type="spellStart"/>
+      <w:r>
+        <w:t>NoOfHolidays</w:t>
+      </w:r>
+      <w:proofErr w:type="spellEnd"/>
+      <w:r>
+        <w:t xml:space="preserve"> = </w:t>
+      </w:r>
+      <w:proofErr w:type="spellStart"/>
+      <w:proofErr w:type="gramStart"/>
+      <w:r>
+        <w:t>dto.NoOfHolidays</w:t>
+      </w:r>
+      <w:proofErr w:type="spellEnd"/>
+      <w:proofErr w:type="gramEnd"/>
+      <w:r>
+        <w:t>,</w:t>
+      </w:r>
+    </w:p>
+    <w:p>
+      <w:pPr>
+        <w:spacing w:after="0" w:line="240" w:lineRule="auto"/>
+      </w:pPr>
+      <w:r>
+        <w:t xml:space="preserve">            </w:t>
+      </w:r>
+      <w:proofErr w:type="spellStart"/>
+      <w:r>
+        <w:t>NoOfWeekends</w:t>
+      </w:r>
+      <w:proofErr w:type="spellEnd"/>
+      <w:r>
+        <w:t xml:space="preserve"> = </w:t>
+      </w:r>
+      <w:proofErr w:type="spellStart"/>
+      <w:proofErr w:type="gramStart"/>
+      <w:r>
+        <w:t>dto.NoOfWeekends</w:t>
+      </w:r>
+      <w:proofErr w:type="spellEnd"/>
+      <w:proofErr w:type="gramEnd"/>
+      <w:r>
+        <w:t>,</w:t>
+      </w:r>
+    </w:p>
+    <w:p>
+      <w:pPr>
+        <w:spacing w:after="0" w:line="240" w:lineRule="auto"/>
+      </w:pPr>
+      <w:r>
+        <w:t xml:space="preserve">            </w:t>
+      </w:r>
+      <w:proofErr w:type="spellStart"/>
+      <w:r>
+        <w:t>LeavePayAdv</w:t>
+      </w:r>
+      <w:proofErr w:type="spellEnd"/>
+      <w:r>
+        <w:t xml:space="preserve"> = </w:t>
+      </w:r>
+      <w:proofErr w:type="spellStart"/>
+      <w:proofErr w:type="gramStart"/>
+      <w:r>
+        <w:t>dto.LeavePayAdv</w:t>
+      </w:r>
+      <w:proofErr w:type="spellEnd"/>
+      <w:proofErr w:type="gramEnd"/>
+      <w:r>
+        <w:t>,</w:t>
+      </w:r>
+    </w:p>
+    <w:p>
+      <w:pPr>
+        <w:spacing w:after="0" w:line="240" w:lineRule="auto"/>
+      </w:pPr>
+      <w:r>
+        <w:t xml:space="preserve">            </w:t>
+      </w:r>
+      <w:proofErr w:type="spellStart"/>
+      <w:r>
+        <w:t>LeaveVisaRequired</w:t>
+      </w:r>
+      <w:proofErr w:type="spellEnd"/>
+      <w:r>
+        <w:t xml:space="preserve"> = </w:t>
+      </w:r>
+      <w:proofErr w:type="spellStart"/>
+      <w:proofErr w:type="gramStart"/>
+      <w:r>
+        <w:t>dto.LeaveVisaRequired</w:t>
+      </w:r>
+      <w:proofErr w:type="spellEnd"/>
+      <w:proofErr w:type="gramEnd"/>
+      <w:r>
+        <w:t>,</w:t>
+      </w:r>
+    </w:p>
+    <w:p>
+      <w:pPr>
+        <w:spacing w:after="0" w:line="240" w:lineRule="auto"/>
+      </w:pPr>
+      <w:r>
+        <w:t xml:space="preserve">            </w:t>
+      </w:r>
+      <w:proofErr w:type="spellStart"/>
+      <w:r>
+        <w:t>LeaveRemarks</w:t>
+      </w:r>
+      <w:proofErr w:type="spellEnd"/>
+      <w:r>
+        <w:t xml:space="preserve"> = </w:t>
+      </w:r>
+      <w:proofErr w:type="spellStart"/>
+      <w:proofErr w:type="gramStart"/>
+      <w:r>
+        <w:t>dto.LeaveRemarks</w:t>
+      </w:r>
+      <w:proofErr w:type="spellEnd"/>
+      <w:proofErr w:type="gramEnd"/>
+      <w:r>
+        <w:t>,</w:t>
+      </w:r>
+    </w:p>
+    <w:p>
+      <w:pPr>
+        <w:spacing w:after="0" w:line="240" w:lineRule="auto"/>
+      </w:pPr>
+      <w:r>
+        <w:t xml:space="preserve">            </w:t>
+      </w:r>
+      <w:proofErr w:type="spellStart"/>
+      <w:r>
+        <w:t>LeaveCreatedBy</w:t>
+      </w:r>
+      <w:proofErr w:type="spellEnd"/>
+      <w:r>
+        <w:t xml:space="preserve"> = </w:t>
+      </w:r>
+      <w:proofErr w:type="spellStart"/>
+      <w:proofErr w:type="gramStart"/>
+      <w:r>
+        <w:t>dto.LeaveCreatedBy</w:t>
+      </w:r>
+      <w:proofErr w:type="spellEnd"/>
+      <w:proofErr w:type="gramEnd"/>
+      <w:r>
+        <w:t>,</w:t>
+      </w:r>
+    </w:p>
+    <w:p>
+      <w:pPr>
+        <w:spacing w:after="0" w:line="240" w:lineRule="auto"/>
+      </w:pPr>
+      <w:r>
+        <w:t xml:space="preserve">            </w:t>
+      </w:r>
+      <w:proofErr w:type="spellStart"/>
+      <w:r>
+        <w:t>LeaveCreatedEmail</w:t>
+      </w:r>
+      <w:proofErr w:type="spellEnd"/>
+      <w:r>
+        <w:t xml:space="preserve"> = </w:t>
+      </w:r>
+      <w:proofErr w:type="spellStart"/>
+      <w:proofErr w:type="gramStart"/>
+      <w:r>
+        <w:t>dto.LeaveCreatedEmail</w:t>
+      </w:r>
+      <w:proofErr w:type="spellEnd"/>
+      <w:proofErr w:type="gramEnd"/>
+      <w:r>
+        <w:t>,</w:t>
+      </w:r>
+    </w:p>
+    <w:p>
+      <w:pPr>
+        <w:spacing w:after="0" w:line="240" w:lineRule="auto"/>
+      </w:pPr>
+      <w:r>
+        <w:t xml:space="preserve">            </w:t>
+      </w:r>
+      <w:proofErr w:type="spellStart"/>
+      <w:r>
+        <w:t>LeaveCreatedUserID</w:t>
+      </w:r>
+      <w:proofErr w:type="spellEnd"/>
+      <w:r>
+        <w:t xml:space="preserve"> = </w:t>
+      </w:r>
+      <w:proofErr w:type="spellStart"/>
+      <w:proofErr w:type="gramStart"/>
+      <w:r>
+        <w:t>dto.LeaveCreatedUserID</w:t>
+      </w:r>
+      <w:proofErr w:type="spellEnd"/>
+      <w:proofErr w:type="gramEnd"/>
+      <w:r>
+        <w:t>,</w:t>
+      </w:r>
+    </w:p>
+    <w:p>
+      <w:pPr>
+        <w:spacing w:after="0" w:line="240" w:lineRule="auto"/>
+      </w:pPr>
+      <w:r>
+        <w:t xml:space="preserve">            </w:t>
+      </w:r>
+      <w:proofErr w:type="spellStart"/>
+      <w:r>
+        <w:t>LeaveCreatedDate</w:t>
+      </w:r>
+      <w:proofErr w:type="spellEnd"/>
+      <w:r>
+        <w:t xml:space="preserve"> = </w:t>
+      </w:r>
+      <w:proofErr w:type="spellStart"/>
+      <w:proofErr w:type="gramStart"/>
+      <w:r>
+        <w:t>dto.LeaveCreatedDate</w:t>
+      </w:r>
+      <w:proofErr w:type="spellEnd"/>
+      <w:proofErr w:type="gramEnd"/>
+      <w:r>
+        <w:t>,</w:t>
+      </w:r>
+    </w:p>
+    <w:p>
+      <w:pPr>
+        <w:spacing w:after="0" w:line="240" w:lineRule="auto"/>
+      </w:pPr>
+      <w:r>
+        <w:t xml:space="preserve">            </w:t>
+      </w:r>
+      <w:proofErr w:type="spellStart"/>
+      <w:r>
+        <w:t>LeaveStatusCode</w:t>
+      </w:r>
+      <w:proofErr w:type="spellEnd"/>
+      <w:r>
+        <w:t xml:space="preserve"> = </w:t>
+      </w:r>
+      <w:proofErr w:type="spellStart"/>
+      <w:proofErr w:type="gramStart"/>
+      <w:r>
+        <w:t>dto.LeaveStatusCode</w:t>
+      </w:r>
+      <w:proofErr w:type="spellEnd"/>
+      <w:proofErr w:type="gramEnd"/>
+      <w:r>
+        <w:t>,</w:t>
+      </w:r>
+    </w:p>
+    <w:p>
+      <w:pPr>
+        <w:spacing w:after="0" w:line="240" w:lineRule="auto"/>
+      </w:pPr>
+      <w:r>
+        <w:t xml:space="preserve">            </w:t>
+      </w:r>
+      <w:proofErr w:type="spellStart"/>
+      <w:r>
+        <w:t>LeaveStatusID</w:t>
+      </w:r>
+      <w:proofErr w:type="spellEnd"/>
+      <w:r>
+        <w:t xml:space="preserve"> = </w:t>
+      </w:r>
+      <w:proofErr w:type="spellStart"/>
+      <w:proofErr w:type="gramStart"/>
+      <w:r>
+        <w:t>dto.LeaveStatusID</w:t>
+      </w:r>
+      <w:proofErr w:type="spellEnd"/>
+      <w:proofErr w:type="gramEnd"/>
+      <w:r>
+        <w:t>,</w:t>
+      </w:r>
+    </w:p>
+    <w:p>
+      <w:pPr>
+        <w:spacing w:after="0" w:line="240" w:lineRule="auto"/>
+      </w:pPr>
+      <w:r>
+        <w:t xml:space="preserve">            </w:t>
+      </w:r>
+      <w:proofErr w:type="spellStart"/>
+      <w:r>
+        <w:t>StatusHandlingCode</w:t>
+      </w:r>
+      <w:proofErr w:type="spellEnd"/>
+      <w:r>
+        <w:t xml:space="preserve"> = </w:t>
+      </w:r>
+      <w:proofErr w:type="spellStart"/>
+      <w:proofErr w:type="gramStart"/>
+      <w:r>
+        <w:t>dto.StatusHandlingCode</w:t>
+      </w:r>
+      <w:proofErr w:type="spellEnd"/>
+      <w:proofErr w:type="gramEnd"/>
+    </w:p>
+    <w:p>
+      <w:pPr>
+        <w:spacing w:after="0" w:line="240" w:lineRule="auto"/>
+      </w:pPr>
+      <w:r>
+        <w:t xml:space="preserve">        };</w:t>
+      </w:r>
+    </w:p>
+    <w:p>
+      <w:pPr>
+        <w:spacing w:after="0" w:line="240" w:lineRule="auto"/>
+      </w:pPr>
+      <w:r>
+        <w:t xml:space="preserve">        #endregion</w:t>
+      </w:r>
+    </w:p>
+    <w:p>
+      <w:pPr>
+        <w:spacing w:after="0" w:line="240" w:lineRule="auto"/>
+      </w:pPr>
+    </w:p>
+    <w:p>
+      <w:pPr>
+        <w:spacing w:after="0" w:line="240" w:lineRule="auto"/>
+      </w:pPr>
+      <w:r>
+        <w:t xml:space="preserve">        #region Initialize attachments</w:t>
+      </w:r>
+    </w:p>
+    <w:p>
+      <w:pPr>
+        <w:spacing w:after="0" w:line="240" w:lineRule="auto"/>
+      </w:pPr>
+      <w:r>
+        <w:t xml:space="preserve">        if (</w:t>
+      </w:r>
+      <w:proofErr w:type="spellStart"/>
+      <w:proofErr w:type="gramStart"/>
+      <w:r>
+        <w:t>dto.AttachmentList</w:t>
+      </w:r>
+      <w:proofErr w:type="spellEnd"/>
+      <w:r>
+        <w:t xml:space="preserve"> !=</w:t>
+      </w:r>
+      <w:proofErr w:type="gramEnd"/>
+      <w:r>
+        <w:t xml:space="preserve"> null &amp;&amp; </w:t>
+      </w:r>
+      <w:proofErr w:type="spellStart"/>
+      <w:proofErr w:type="gramStart"/>
+      <w:r>
+        <w:t>dto.AttachmentList.Any</w:t>
+      </w:r>
+      <w:proofErr w:type="spellEnd"/>
+      <w:proofErr w:type="gramEnd"/>
+      <w:r>
+        <w:t>())</w:t>
+      </w:r>
+    </w:p>
+    <w:p>
+      <w:pPr>
+        <w:spacing w:after="0" w:line="240" w:lineRule="auto"/>
+      </w:pPr>
+      <w:r>
+        <w:t xml:space="preserve">        {</w:t>
+      </w:r>
+    </w:p>
+    <w:p>
+      <w:pPr>
+        <w:spacing w:after="0" w:line="240" w:lineRule="auto"/>
+      </w:pPr>
+      <w:r>
+        <w:t xml:space="preserve">            </w:t>
+      </w:r>
+      <w:proofErr w:type="spellStart"/>
+      <w:r>
+        <w:t>leaveRequest.AttachmentList</w:t>
+      </w:r>
+      <w:proofErr w:type="spellEnd"/>
+      <w:r>
+        <w:t xml:space="preserve"> = </w:t>
+      </w:r>
+      <w:proofErr w:type="spellStart"/>
+      <w:proofErr w:type="gramStart"/>
+      <w:r>
+        <w:t>dto.AttachmentList.Select</w:t>
+      </w:r>
+      <w:proofErr w:type="spellEnd"/>
+      <w:proofErr w:type="gramEnd"/>
+      <w:r>
+        <w:t xml:space="preserve">(e =&gt; new </w:t>
+      </w:r>
+      <w:proofErr w:type="spellStart"/>
+      <w:r>
+        <w:t>LeaveAttachment</w:t>
+      </w:r>
+      <w:proofErr w:type="spellEnd"/>
+    </w:p>
+    <w:p>
+      <w:pPr>
+        <w:spacing w:after="0" w:line="240" w:lineRule="auto"/>
+      </w:pPr>
+      <w:r>
+        <w:t xml:space="preserve">            {</w:t>
+      </w:r>
+    </w:p>
+    <w:p>
+      <w:pPr>
+        <w:spacing w:after="0" w:line="240" w:lineRule="auto"/>
+      </w:pPr>
+      <w:r>
+        <w:t xml:space="preserve">                </w:t>
+      </w:r>
+      <w:proofErr w:type="spellStart"/>
+      <w:r>
+        <w:t>LeaveAttachmentId</w:t>
+      </w:r>
+      <w:proofErr w:type="spellEnd"/>
+      <w:r>
+        <w:t xml:space="preserve"> = </w:t>
+      </w:r>
+      <w:proofErr w:type="spellStart"/>
+      <w:proofErr w:type="gramStart"/>
+      <w:r>
+        <w:t>e.LeaveAttachmentId</w:t>
+      </w:r>
+      <w:proofErr w:type="spellEnd"/>
+      <w:proofErr w:type="gramEnd"/>
+      <w:r>
+        <w:t>,</w:t>
+      </w:r>
+    </w:p>
+    <w:p>
+      <w:pPr>
+        <w:spacing w:after="0" w:line="240" w:lineRule="auto"/>
+      </w:pPr>
+      <w:r>
+        <w:t xml:space="preserve">                </w:t>
+      </w:r>
+      <w:proofErr w:type="spellStart"/>
+      <w:r>
+        <w:t>FileName</w:t>
+      </w:r>
+      <w:proofErr w:type="spellEnd"/>
+      <w:r>
+        <w:t xml:space="preserve"> = </w:t>
+      </w:r>
+      <w:proofErr w:type="spellStart"/>
+      <w:proofErr w:type="gramStart"/>
+      <w:r>
+        <w:t>e.FileName</w:t>
+      </w:r>
+      <w:proofErr w:type="spellEnd"/>
+      <w:proofErr w:type="gramEnd"/>
+      <w:r>
+        <w:t>,</w:t>
+      </w:r>
+    </w:p>
+    <w:p>
+      <w:pPr>
+        <w:spacing w:after="0" w:line="240" w:lineRule="auto"/>
+      </w:pPr>
+      <w:r>
+        <w:t xml:space="preserve">                </w:t>
+      </w:r>
+      <w:proofErr w:type="spellStart"/>
+      <w:r>
+        <w:t>StoredFileName</w:t>
+      </w:r>
+      <w:proofErr w:type="spellEnd"/>
+      <w:r>
+        <w:t xml:space="preserve"> = </w:t>
+      </w:r>
+      <w:proofErr w:type="spellStart"/>
+      <w:proofErr w:type="gramStart"/>
+      <w:r>
+        <w:t>e.StoredFileName</w:t>
+      </w:r>
+      <w:proofErr w:type="spellEnd"/>
+      <w:proofErr w:type="gramEnd"/>
+      <w:r>
+        <w:t>,</w:t>
+      </w:r>
+    </w:p>
+    <w:p>
+      <w:pPr>
+        <w:spacing w:after="0" w:line="240" w:lineRule="auto"/>
+      </w:pPr>
+      <w:r>
+        <w:t xml:space="preserve">                </w:t>
+      </w:r>
+      <w:proofErr w:type="spellStart"/>
+      <w:r>
+        <w:t>ContentType</w:t>
+      </w:r>
+      <w:proofErr w:type="spellEnd"/>
+      <w:r>
+        <w:t xml:space="preserve"> = </w:t>
+      </w:r>
+      <w:proofErr w:type="spellStart"/>
+      <w:proofErr w:type="gramStart"/>
+      <w:r>
+        <w:t>e.ContentType</w:t>
+      </w:r>
+      <w:proofErr w:type="spellEnd"/>
+      <w:proofErr w:type="gramEnd"/>
+      <w:r>
+        <w:t>,</w:t>
+      </w:r>
+    </w:p>
+    <w:p>
+      <w:pPr>
+        <w:spacing w:after="0" w:line="240" w:lineRule="auto"/>
+      </w:pPr>
+      <w:r>
+        <w:t xml:space="preserve">                </w:t>
+      </w:r>
+      <w:proofErr w:type="spellStart"/>
+      <w:r>
+        <w:t>FileSize</w:t>
+      </w:r>
+      <w:proofErr w:type="spellEnd"/>
+      <w:r>
+        <w:t xml:space="preserve"> = </w:t>
+      </w:r>
+      <w:proofErr w:type="spellStart"/>
+      <w:proofErr w:type="gramStart"/>
+      <w:r>
+        <w:t>e.FileSize</w:t>
+      </w:r>
+      <w:proofErr w:type="spellEnd"/>
+      <w:proofErr w:type="gramEnd"/>
+    </w:p>
+    <w:p>
+      <w:pPr>
+        <w:spacing w:after="0" w:line="240" w:lineRule="auto"/>
+      </w:pPr>
+      <w:r>
+        <w:t xml:space="preserve">            }</w:t>
+      </w:r>
+      <w:proofErr w:type="gramStart"/>
+      <w:r>
+        <w:t>).</w:t>
+      </w:r>
+      <w:proofErr w:type="spellStart"/>
+      <w:r>
+        <w:t>ToList</w:t>
+      </w:r>
+      <w:proofErr w:type="spellEnd"/>
+      <w:proofErr w:type="gramEnd"/>
+      <w:r>
+        <w:t>();</w:t>
+      </w:r>
+    </w:p>
+    <w:p>
+      <w:pPr>
+        <w:spacing w:after="0" w:line="240" w:lineRule="auto"/>
+      </w:pPr>
+      <w:r>
+        <w:t xml:space="preserve">        }</w:t>
+      </w:r>
+    </w:p>
+    <w:p>
+      <w:pPr>
+        <w:spacing w:after="0" w:line="240" w:lineRule="auto"/>
+      </w:pPr>
+      <w:r>
+        <w:t xml:space="preserve">        #endregion</w:t>
+      </w:r>
+    </w:p>
+    <w:p>
+      <w:pPr>
+        <w:spacing w:after="0" w:line="240" w:lineRule="auto"/>
+      </w:pPr>
+    </w:p>
+    <w:p>
+      <w:pPr>
+        <w:spacing w:after="0" w:line="240" w:lineRule="auto"/>
+      </w:pPr>
+      <w:r>
+        <w:t xml:space="preserve">        // Save to database</w:t>
+      </w:r>
+    </w:p>
+    <w:p>
+      <w:pPr>
+        <w:spacing w:after="0" w:line="240" w:lineRule="auto"/>
+      </w:pPr>
+      <w:r>
+        <w:t xml:space="preserve">        await _</w:t>
+      </w:r>
+      <w:proofErr w:type="spellStart"/>
+      <w:proofErr w:type="gramStart"/>
+      <w:r>
+        <w:t>db.LeaveRequisitionWFs.AddAsync</w:t>
+      </w:r>
+      <w:proofErr w:type="spellEnd"/>
+      <w:proofErr w:type="gramEnd"/>
+      <w:r>
+        <w:t>(</w:t>
+      </w:r>
+      <w:proofErr w:type="spellStart"/>
+      <w:r>
+        <w:t>leaveRequest</w:t>
+      </w:r>
+      <w:proofErr w:type="spellEnd"/>
+      <w:r>
+        <w:t>);</w:t>
+      </w:r>
+    </w:p>
+    <w:p>
+      <w:pPr>
+        <w:spacing w:after="0" w:line="240" w:lineRule="auto"/>
+      </w:pPr>
+      <w:r>
+        <w:t xml:space="preserve">        </w:t>
+      </w:r>
+      <w:proofErr w:type="spellStart"/>
+      <w:r>
+        <w:t>rowsInserted</w:t>
+      </w:r>
+      <w:proofErr w:type="spellEnd"/>
+      <w:r>
+        <w:t xml:space="preserve"> = await _</w:t>
+      </w:r>
+      <w:proofErr w:type="spellStart"/>
+      <w:proofErr w:type="gramStart"/>
+      <w:r>
+        <w:t>db.SaveChangesAsync</w:t>
+      </w:r>
+      <w:proofErr w:type="spellEnd"/>
+      <w:proofErr w:type="gramEnd"/>
+      <w:r>
+        <w:t>(</w:t>
+      </w:r>
+      <w:proofErr w:type="spellStart"/>
+      <w:r>
+        <w:t>cancellationToken</w:t>
+      </w:r>
+      <w:proofErr w:type="spellEnd"/>
+      <w:r>
+        <w:t>);</w:t>
+      </w:r>
+    </w:p>
+    <w:p>
+      <w:pPr>
+        <w:spacing w:after="0" w:line="240" w:lineRule="auto"/>
+      </w:pPr>
+    </w:p>
+    <w:p>
+      <w:pPr>
+        <w:spacing w:after="0" w:line="240" w:lineRule="auto"/>
+      </w:pPr>
+      <w:r>
+        <w:t xml:space="preserve">        return Result&lt;int&gt;.</w:t>
+      </w:r>
+      <w:proofErr w:type="spellStart"/>
+      <w:r>
+        <w:t>SuccessResult</w:t>
+      </w:r>
+      <w:proofErr w:type="spellEnd"/>
+      <w:r>
+        <w:t>(</w:t>
+      </w:r>
+      <w:proofErr w:type="spellStart"/>
+      <w:r>
+        <w:t>rowsInserted</w:t>
+      </w:r>
+      <w:proofErr w:type="spellEnd"/>
+      <w:r>
+        <w:t>);</w:t>
+      </w:r>
+    </w:p>
+    <w:p>
+      <w:pPr>
+        <w:spacing w:after="0" w:line="240" w:lineRule="auto"/>
+      </w:pPr>
+    </w:p>
+    <w:p>
+      <w:pPr>
+        <w:spacing w:after="0" w:line="240" w:lineRule="auto"/>
+      </w:pPr>
+      <w:r>
+        <w:t xml:space="preserve">    }</w:t>
+      </w:r>
+    </w:p>
+    <w:p>
+      <w:pPr>
+        <w:spacing w:after="0" w:line="240" w:lineRule="auto"/>
+      </w:pPr>
+      <w:r>
+        <w:t xml:space="preserve">    catch (</w:t>
+      </w:r>
+      <w:proofErr w:type="spellStart"/>
+      <w:r>
+        <w:t>InvalidOperationException</w:t>
+      </w:r>
+      <w:proofErr w:type="spellEnd"/>
+      <w:r>
+        <w:t xml:space="preserve"> </w:t>
+      </w:r>
+      <w:proofErr w:type="spellStart"/>
+      <w:r>
+        <w:t>invEx</w:t>
+      </w:r>
+      <w:proofErr w:type="spellEnd"/>
+      <w:r>
+        <w:t>)</w:t>
+      </w:r>
+    </w:p>
+    <w:p>
+      <w:pPr>
+        <w:spacing w:after="0" w:line="240" w:lineRule="auto"/>
+      </w:pPr>
+      <w:r>
+        <w:t xml:space="preserve">    {</w:t>
+      </w:r>
+    </w:p>
+    <w:p>
+      <w:pPr>
+        <w:spacing w:after="0" w:line="240" w:lineRule="auto"/>
+      </w:pPr>
+      <w:r>
+        <w:t xml:space="preserve">        throw new </w:t>
+      </w:r>
+      <w:proofErr w:type="gramStart"/>
+      <w:r>
+        <w:t>Exception(</w:t>
+      </w:r>
+      <w:proofErr w:type="spellStart"/>
+      <w:r>
+        <w:t>invEx.Message.ToString</w:t>
+      </w:r>
+      <w:proofErr w:type="spellEnd"/>
+      <w:proofErr w:type="gramEnd"/>
+      <w:r>
+        <w:t>());</w:t>
+      </w:r>
+    </w:p>
+    <w:p>
+      <w:pPr>
+        <w:spacing w:after="0" w:line="240" w:lineRule="auto"/>
+      </w:pPr>
+      <w:r>
+        <w:t xml:space="preserve">    }</w:t>
+      </w:r>
+    </w:p>
+    <w:p>
+      <w:pPr>
+        <w:spacing w:after="0" w:line="240" w:lineRule="auto"/>
+      </w:pPr>
+      <w:r>
+        <w:t xml:space="preserve">    catch (Exception ex)</w:t>
+      </w:r>
+    </w:p>
+    <w:p>
+      <w:pPr>
+        <w:spacing w:after="0" w:line="240" w:lineRule="auto"/>
+      </w:pPr>
+      <w:r>
+        <w:t xml:space="preserve">    {</w:t>
+      </w:r>
+    </w:p>
+    <w:p>
+      <w:pPr>
+        <w:spacing w:after="0" w:line="240" w:lineRule="auto"/>
+      </w:pPr>
+      <w:r>
+        <w:t xml:space="preserve">        if (</w:t>
+      </w:r>
+      <w:proofErr w:type="spellStart"/>
+      <w:proofErr w:type="gramStart"/>
+      <w:r>
+        <w:t>ex.InnerException</w:t>
+      </w:r>
+      <w:proofErr w:type="spellEnd"/>
+      <w:r>
+        <w:t xml:space="preserve"> !=</w:t>
+      </w:r>
+      <w:proofErr w:type="gramEnd"/>
+      <w:r>
+        <w:t xml:space="preserve"> null)</w:t>
+      </w:r>
+    </w:p>
+    <w:p>
+      <w:pPr>
+        <w:spacing w:after="0" w:line="240" w:lineRule="auto"/>
+      </w:pPr>
+      <w:r>
+        <w:t xml:space="preserve">            return Result&lt;int&gt;.Failure($"Database error: {</w:t>
+      </w:r>
+      <w:proofErr w:type="spellStart"/>
+      <w:proofErr w:type="gramStart"/>
+      <w:r>
+        <w:t>ex.InnerException.Message</w:t>
+      </w:r>
+      <w:proofErr w:type="spellEnd"/>
+      <w:proofErr w:type="gramEnd"/>
+      <w:r>
+        <w:t>}");</w:t>
+      </w:r>
+    </w:p>
+    <w:p>
+      <w:pPr>
+        <w:spacing w:after="0" w:line="240" w:lineRule="auto"/>
+      </w:pPr>
+      <w:r>
+        <w:t xml:space="preserve">        else</w:t>
+      </w:r>
+    </w:p>
+    <w:p>
+      <w:pPr>
+        <w:spacing w:after="0" w:line="240" w:lineRule="auto"/>
+      </w:pPr>
+      <w:r>
+        <w:t xml:space="preserve">            return Result&lt;int&gt;.Failure($"Database error: {</w:t>
+      </w:r>
+      <w:proofErr w:type="spellStart"/>
+      <w:proofErr w:type="gramStart"/>
+      <w:r>
+        <w:t>ex.Message</w:t>
+      </w:r>
+      <w:proofErr w:type="spellEnd"/>
+      <w:proofErr w:type="gramEnd"/>
+      <w:r>
+        <w:t>}");</w:t>
+      </w:r>
+    </w:p>
+    <w:p>
+      <w:pPr>
+        <w:spacing w:after="0" w:line="240" w:lineRule="auto"/>
+      </w:pPr>
+      <w:r>
+        <w:t xml:space="preserve">    }</w:t>
+      </w:r>
+    </w:p>
+    <w:p>
+      <w:pPr>
+        <w:spacing w:after="0" w:line="240" w:lineRule="auto"/>
+      </w:pPr>
+      <w:r>
+        <w:t>}</w:t>
+      </w:r>
+    </w:p>
+    <w:p>
+      <w:pPr>
+        <w:spacing w:after="0" w:line="240" w:lineRule="auto"/>
+      </w:pPr>
+    </w:p>
+    <w:p>
+      <w:pPr>
+        <w:spacing w:after="0" w:line="240" w:lineRule="auto"/>
+      </w:pPr>
+      <w:r>
+        <w:t>Domain Entity Class:</w:t>
+      </w:r>
+    </w:p>
+    <w:p>
+      <w:pPr>
+        <w:spacing w:after="0" w:line="240" w:lineRule="auto"/>
+      </w:pPr>
+      <w:r>
+        <w:t xml:space="preserve">public class </w:t>
+      </w:r>
+      <w:proofErr w:type="spellStart"/>
+      <w:r>
+        <w:t>LeaveRequisitionWF</w:t>
+      </w:r>
+      <w:proofErr w:type="spellEnd"/>
+    </w:p>
+    <w:p>
+      <w:pPr>
+        <w:spacing w:after="0" w:line="240" w:lineRule="auto"/>
+      </w:pPr>
+      <w:r>
+        <w:t xml:space="preserve"> {</w:t>
+      </w:r>
+    </w:p>
+    <w:p>
+      <w:pPr>
+        <w:spacing w:after="0" w:line="240" w:lineRule="auto"/>
+      </w:pPr>
+      <w:r>
+        <w:t xml:space="preserve">     </w:t>
+      </w:r>
+    </w:p>
+    <w:p>
+      <w:pPr>
+        <w:spacing w:after="0" w:line="240" w:lineRule="auto"/>
+      </w:pPr>
+      <w:r>
+        <w:t xml:space="preserve">     #region Properties</w:t>
+      </w:r>
+    </w:p>
+    <w:p>
+      <w:pPr>
+        <w:spacing w:after="0" w:line="240" w:lineRule="auto"/>
+      </w:pPr>
+      <w:r>
+        <w:t xml:space="preserve">     public long </w:t>
+      </w:r>
+      <w:proofErr w:type="spellStart"/>
+      <w:r>
+        <w:t>LeaveRequestId</w:t>
+      </w:r>
+      <w:proofErr w:type="spellEnd"/>
+      <w:r>
+        <w:t xml:space="preserve"> </w:t>
+      </w:r>
+      <w:proofErr w:type="gramStart"/>
+      <w:r>
+        <w:t>{ get</w:t>
+      </w:r>
+      <w:proofErr w:type="gramEnd"/>
+      <w:r>
+        <w:t>; set</w:t>
+      </w:r>
+      <w:proofErr w:type="gramStart"/>
+      <w:r>
+        <w:t>; }</w:t>
+      </w:r>
+      <w:proofErr w:type="gramEnd"/>
+      <w:r>
+        <w:t xml:space="preserve">       // Identity column  </w:t>
+      </w:r>
+    </w:p>
+    <w:p>
+      <w:pPr>
+        <w:spacing w:after="0" w:line="240" w:lineRule="auto"/>
+      </w:pPr>
+      <w:r>
+        <w:t xml:space="preserve">     public </w:t>
+      </w:r>
+      <w:proofErr w:type="spellStart"/>
+      <w:r>
+        <w:t>Guid</w:t>
+      </w:r>
+      <w:proofErr w:type="spellEnd"/>
+      <w:r>
+        <w:t xml:space="preserve"> </w:t>
+      </w:r>
+      <w:proofErr w:type="spellStart"/>
+      <w:r>
+        <w:t>LeaveAttachmentId</w:t>
+      </w:r>
+      <w:proofErr w:type="spellEnd"/>
+      <w:r>
+        <w:t xml:space="preserve"> </w:t>
+      </w:r>
+      <w:proofErr w:type="gramStart"/>
+      <w:r>
+        <w:t>{ get</w:t>
+      </w:r>
+      <w:proofErr w:type="gramEnd"/>
+      <w:r>
+        <w:t>; private set</w:t>
+      </w:r>
+      <w:proofErr w:type="gramStart"/>
+      <w:r>
+        <w:t>; }</w:t>
+      </w:r>
+      <w:proofErr w:type="gramEnd"/>
+      <w:r>
+        <w:t xml:space="preserve"> = </w:t>
+      </w:r>
+      <w:proofErr w:type="spellStart"/>
+      <w:r>
+        <w:t>Guid.NewGuid</w:t>
+      </w:r>
+      <w:proofErr w:type="spellEnd"/>
+      <w:r>
+        <w:t>();</w:t>
+      </w:r>
+    </w:p>
+    <w:p>
+      <w:pPr>
+        <w:spacing w:after="0" w:line="240" w:lineRule="auto"/>
+      </w:pPr>
+      <w:r>
+        <w:t xml:space="preserve">     public </w:t>
+      </w:r>
+      <w:proofErr w:type="spellStart"/>
+      <w:r>
+        <w:t>Guid</w:t>
+      </w:r>
+      <w:proofErr w:type="spellEnd"/>
+      <w:r>
+        <w:t xml:space="preserve"> </w:t>
+      </w:r>
+      <w:proofErr w:type="spellStart"/>
+      <w:r>
+        <w:t>WorkflowId</w:t>
+      </w:r>
+      <w:proofErr w:type="spellEnd"/>
+      <w:r>
+        <w:t xml:space="preserve"> </w:t>
+      </w:r>
+      <w:proofErr w:type="gramStart"/>
+      <w:r>
+        <w:t>{ get</w:t>
+      </w:r>
+      <w:proofErr w:type="gramEnd"/>
+      <w:r>
+        <w:t>; private set</w:t>
+      </w:r>
+      <w:proofErr w:type="gramStart"/>
+      <w:r>
+        <w:t>; }</w:t>
+      </w:r>
+      <w:proofErr w:type="gramEnd"/>
+      <w:r>
+        <w:t xml:space="preserve"> = </w:t>
+      </w:r>
+      <w:proofErr w:type="spellStart"/>
+      <w:r>
+        <w:t>Guid.NewGuid</w:t>
+      </w:r>
+      <w:proofErr w:type="spellEnd"/>
+      <w:r>
+        <w:t>();</w:t>
+      </w:r>
+    </w:p>
+    <w:p>
+      <w:pPr>
+        <w:spacing w:after="0" w:line="240" w:lineRule="auto"/>
+      </w:pPr>
+    </w:p>
+    <w:p>
+      <w:pPr>
+        <w:spacing w:after="0" w:line="240" w:lineRule="auto"/>
+      </w:pPr>
+      <w:r>
+        <w:t xml:space="preserve">     [</w:t>
+      </w:r>
+      <w:proofErr w:type="gramStart"/>
+      <w:r>
+        <w:t>Column(</w:t>
+      </w:r>
+      <w:proofErr w:type="gramEnd"/>
+      <w:r>
+        <w:t>TypeName = "</w:t>
+      </w:r>
+      <w:proofErr w:type="gramStart"/>
+      <w:r>
+        <w:t>varchar(</w:t>
+      </w:r>
+      <w:proofErr w:type="gramEnd"/>
+      <w:r>
+        <w:t>50)")]</w:t>
+      </w:r>
+    </w:p>
+    <w:p>
+      <w:pPr>
+        <w:spacing w:after="0" w:line="240" w:lineRule="auto"/>
+      </w:pPr>
+      <w:r>
+        <w:t xml:space="preserve">     public string? </w:t>
+      </w:r>
+      <w:proofErr w:type="spellStart"/>
+      <w:r>
+        <w:t>LeaveInstanceID</w:t>
+      </w:r>
+      <w:proofErr w:type="spellEnd"/>
+      <w:r>
+        <w:t xml:space="preserve"> </w:t>
+      </w:r>
+      <w:proofErr w:type="gramStart"/>
+      <w:r>
+        <w:t>{ get</w:t>
+      </w:r>
+      <w:proofErr w:type="gramEnd"/>
+      <w:r>
+        <w:t>; set</w:t>
+      </w:r>
+      <w:proofErr w:type="gramStart"/>
+      <w:r>
+        <w:t>; }</w:t>
+      </w:r>
+      <w:proofErr w:type="gramEnd"/>
+      <w:r>
+        <w:t xml:space="preserve"> = null;</w:t>
+      </w:r>
+    </w:p>
+    <w:p>
+      <w:pPr>
+        <w:spacing w:after="0" w:line="240" w:lineRule="auto"/>
+      </w:pPr>
+    </w:p>
+    <w:p>
+      <w:pPr>
+        <w:spacing w:after="0" w:line="240" w:lineRule="auto"/>
+      </w:pPr>
+      <w:r>
+        <w:t xml:space="preserve">     [</w:t>
+      </w:r>
+      <w:proofErr w:type="gramStart"/>
+      <w:r>
+        <w:t>Column(</w:t>
+      </w:r>
+      <w:proofErr w:type="gramEnd"/>
+      <w:r>
+        <w:t>TypeName = "</w:t>
+      </w:r>
+      <w:proofErr w:type="gramStart"/>
+      <w:r>
+        <w:t>varchar(</w:t>
+      </w:r>
+      <w:proofErr w:type="gramEnd"/>
+      <w:r>
+        <w:t>20)")]</w:t>
+      </w:r>
+    </w:p>
+    <w:p>
+      <w:pPr>
+        <w:spacing w:after="0" w:line="240" w:lineRule="auto"/>
+      </w:pPr>
+      <w:r>
+        <w:t xml:space="preserve">     public string </w:t>
+      </w:r>
+      <w:proofErr w:type="spellStart"/>
+      <w:r>
+        <w:t>LeaveType</w:t>
+      </w:r>
+      <w:proofErr w:type="spellEnd"/>
+      <w:r>
+        <w:t xml:space="preserve"> </w:t>
+      </w:r>
+      <w:proofErr w:type="gramStart"/>
+      <w:r>
+        <w:t>{ get</w:t>
+      </w:r>
+      <w:proofErr w:type="gramEnd"/>
+      <w:r>
+        <w:t>; set</w:t>
+      </w:r>
+      <w:proofErr w:type="gramStart"/>
+      <w:r>
+        <w:t>; }</w:t>
+      </w:r>
+      <w:proofErr w:type="gramEnd"/>
+      <w:r>
+        <w:t xml:space="preserve"> = </w:t>
+      </w:r>
+      <w:proofErr w:type="gramStart"/>
+      <w:r>
+        <w:t>null!;</w:t>
+      </w:r>
+      <w:proofErr w:type="gramEnd"/>
+    </w:p>
+    <w:p>
+      <w:pPr>
+        <w:spacing w:after="0" w:line="240" w:lineRule="auto"/>
+      </w:pPr>
+    </w:p>
+    <w:p>
+      <w:pPr>
+        <w:spacing w:after="0" w:line="240" w:lineRule="auto"/>
+      </w:pPr>
+      <w:r>
+        <w:t xml:space="preserve">     public int </w:t>
+      </w:r>
+      <w:proofErr w:type="spellStart"/>
+      <w:r>
+        <w:t>LeaveEmpNo</w:t>
+      </w:r>
+      <w:proofErr w:type="spellEnd"/>
+      <w:r>
+        <w:t xml:space="preserve"> </w:t>
+      </w:r>
+      <w:proofErr w:type="gramStart"/>
+      <w:r>
+        <w:t>{ get</w:t>
+      </w:r>
+      <w:proofErr w:type="gramEnd"/>
+      <w:r>
+        <w:t>; set</w:t>
+      </w:r>
+      <w:proofErr w:type="gramStart"/>
+      <w:r>
+        <w:t>; }</w:t>
+      </w:r>
+      <w:proofErr w:type="gramEnd"/>
+    </w:p>
+    <w:p>
+      <w:pPr>
+        <w:spacing w:after="0" w:line="240" w:lineRule="auto"/>
+      </w:pPr>
+    </w:p>
+    <w:p>
+      <w:pPr>
+        <w:spacing w:after="0" w:line="240" w:lineRule="auto"/>
+      </w:pPr>
+      <w:r>
+        <w:t xml:space="preserve">     [</w:t>
+      </w:r>
+      <w:proofErr w:type="gramStart"/>
+      <w:r>
+        <w:t>Column(</w:t>
+      </w:r>
+      <w:proofErr w:type="gramEnd"/>
+      <w:r>
+        <w:t>TypeName = "</w:t>
+      </w:r>
+      <w:proofErr w:type="gramStart"/>
+      <w:r>
+        <w:t>varchar(</w:t>
+      </w:r>
+      <w:proofErr w:type="gramEnd"/>
+      <w:r>
+        <w:t>150)")]</w:t>
+      </w:r>
+    </w:p>
+    <w:p>
+      <w:pPr>
+        <w:spacing w:after="0" w:line="240" w:lineRule="auto"/>
+      </w:pPr>
+      <w:r>
+        <w:t xml:space="preserve">     public string? </w:t>
+      </w:r>
+      <w:proofErr w:type="spellStart"/>
+      <w:r>
+        <w:t>LeaveEmpName</w:t>
+      </w:r>
+      <w:proofErr w:type="spellEnd"/>
+      <w:r>
+        <w:t xml:space="preserve"> </w:t>
+      </w:r>
+      <w:proofErr w:type="gramStart"/>
+      <w:r>
+        <w:t>{ get</w:t>
+      </w:r>
+      <w:proofErr w:type="gramEnd"/>
+      <w:r>
+        <w:t>; set</w:t>
+      </w:r>
+      <w:proofErr w:type="gramStart"/>
+      <w:r>
+        <w:t>; }</w:t>
+      </w:r>
+      <w:proofErr w:type="gramEnd"/>
+      <w:r>
+        <w:t xml:space="preserve"> = null;</w:t>
+      </w:r>
+    </w:p>
+    <w:p>
+      <w:pPr>
+        <w:spacing w:after="0" w:line="240" w:lineRule="auto"/>
+      </w:pPr>
+    </w:p>
+    <w:p>
+      <w:pPr>
+        <w:spacing w:after="0" w:line="240" w:lineRule="auto"/>
+      </w:pPr>
+      <w:r>
+        <w:t xml:space="preserve">     [</w:t>
+      </w:r>
+      <w:proofErr w:type="gramStart"/>
+      <w:r>
+        <w:t>Column(</w:t>
+      </w:r>
+      <w:proofErr w:type="gramEnd"/>
+      <w:r>
+        <w:t>TypeName = "</w:t>
+      </w:r>
+      <w:proofErr w:type="gramStart"/>
+      <w:r>
+        <w:t>varchar(</w:t>
+      </w:r>
+      <w:proofErr w:type="gramEnd"/>
+      <w:r>
+        <w:t>50)")]</w:t>
+      </w:r>
+    </w:p>
+    <w:p>
+      <w:pPr>
+        <w:spacing w:after="0" w:line="240" w:lineRule="auto"/>
+      </w:pPr>
+      <w:r>
+        <w:t xml:space="preserve">     public string? </w:t>
+      </w:r>
+      <w:proofErr w:type="spellStart"/>
+      <w:r>
+        <w:t>LeaveEmpEmail</w:t>
+      </w:r>
+      <w:proofErr w:type="spellEnd"/>
+      <w:r>
+        <w:t xml:space="preserve"> </w:t>
+      </w:r>
+      <w:proofErr w:type="gramStart"/>
+      <w:r>
+        <w:t>{ get</w:t>
+      </w:r>
+      <w:proofErr w:type="gramEnd"/>
+      <w:r>
+        <w:t>; set</w:t>
+      </w:r>
+      <w:proofErr w:type="gramStart"/>
+      <w:r>
+        <w:t>; }</w:t>
+      </w:r>
+      <w:proofErr w:type="gramEnd"/>
+      <w:r>
+        <w:t xml:space="preserve"> = null;</w:t>
+      </w:r>
+    </w:p>
+    <w:p>
+      <w:pPr>
+        <w:spacing w:after="0" w:line="240" w:lineRule="auto"/>
+      </w:pPr>
+    </w:p>
+    <w:p>
+      <w:pPr>
+        <w:spacing w:after="0" w:line="240" w:lineRule="auto"/>
+      </w:pPr>
+      <w:r>
+        <w:t xml:space="preserve">     [</w:t>
+      </w:r>
+      <w:proofErr w:type="gramStart"/>
+      <w:r>
+        <w:t>Column(</w:t>
+      </w:r>
+      <w:proofErr w:type="gramEnd"/>
+      <w:r>
+        <w:t>TypeName = "datetime")]</w:t>
+      </w:r>
+    </w:p>
+    <w:p>
+      <w:pPr>
+        <w:spacing w:after="0" w:line="240" w:lineRule="auto"/>
+      </w:pPr>
+      <w:r>
+        <w:t xml:space="preserve">     public </w:t>
+      </w:r>
+      <w:proofErr w:type="spellStart"/>
+      <w:r>
+        <w:t>DateTime</w:t>
+      </w:r>
+      <w:proofErr w:type="spellEnd"/>
+      <w:r>
+        <w:t xml:space="preserve"> </w:t>
+      </w:r>
+      <w:proofErr w:type="spellStart"/>
+      <w:r>
+        <w:t>LeaveStartDate</w:t>
+      </w:r>
+      <w:proofErr w:type="spellEnd"/>
+      <w:r>
+        <w:t xml:space="preserve"> </w:t>
+      </w:r>
+      <w:proofErr w:type="gramStart"/>
+      <w:r>
+        <w:t>{ get</w:t>
+      </w:r>
+      <w:proofErr w:type="gramEnd"/>
+      <w:r>
+        <w:t>; set</w:t>
+      </w:r>
+      <w:proofErr w:type="gramStart"/>
+      <w:r>
+        <w:t>; }</w:t>
+      </w:r>
+      <w:proofErr w:type="gramEnd"/>
+    </w:p>
+    <w:p>
+      <w:pPr>
+        <w:spacing w:after="0" w:line="240" w:lineRule="auto"/>
+      </w:pPr>
+    </w:p>
+    <w:p>
+      <w:pPr>
+        <w:spacing w:after="0" w:line="240" w:lineRule="auto"/>
+      </w:pPr>
+      <w:r>
+        <w:t xml:space="preserve">     [</w:t>
+      </w:r>
+      <w:proofErr w:type="gramStart"/>
+      <w:r>
+        <w:t>Column(</w:t>
+      </w:r>
+      <w:proofErr w:type="gramEnd"/>
+      <w:r>
+        <w:t>TypeName = "datetime")]</w:t>
+      </w:r>
+    </w:p>
+    <w:p>
+      <w:pPr>
+        <w:spacing w:after="0" w:line="240" w:lineRule="auto"/>
+      </w:pPr>
+      <w:r>
+        <w:lastRenderedPageBreak/>
+        <w:t xml:space="preserve">     public </w:t>
+      </w:r>
+      <w:proofErr w:type="spellStart"/>
+      <w:r>
+        <w:t>DateTime</w:t>
+      </w:r>
+      <w:proofErr w:type="spellEnd"/>
+      <w:r>
+        <w:t xml:space="preserve"> </w:t>
+      </w:r>
+      <w:proofErr w:type="spellStart"/>
+      <w:r>
+        <w:t>LeaveEndDate</w:t>
+      </w:r>
+      <w:proofErr w:type="spellEnd"/>
+      <w:r>
+        <w:t xml:space="preserve"> </w:t>
+      </w:r>
+      <w:proofErr w:type="gramStart"/>
+      <w:r>
+        <w:t>{ get</w:t>
+      </w:r>
+      <w:proofErr w:type="gramEnd"/>
+      <w:r>
+        <w:t>; set</w:t>
+      </w:r>
+      <w:proofErr w:type="gramStart"/>
+      <w:r>
+        <w:t>; }</w:t>
+      </w:r>
+      <w:proofErr w:type="gramEnd"/>
+    </w:p>
+    <w:p>
+      <w:pPr>
+        <w:spacing w:after="0" w:line="240" w:lineRule="auto"/>
+      </w:pPr>
+    </w:p>
+    <w:p>
+      <w:pPr>
+        <w:spacing w:after="0" w:line="240" w:lineRule="auto"/>
+      </w:pPr>
+      <w:r>
+        <w:t xml:space="preserve">     [</w:t>
+      </w:r>
+      <w:proofErr w:type="gramStart"/>
+      <w:r>
+        <w:t>Column(</w:t>
+      </w:r>
+      <w:proofErr w:type="gramEnd"/>
+      <w:r>
+        <w:t>TypeName = "datetime")]</w:t>
+      </w:r>
+    </w:p>
+    <w:p>
+      <w:pPr>
+        <w:spacing w:after="0" w:line="240" w:lineRule="auto"/>
+      </w:pPr>
+      <w:r>
+        <w:t xml:space="preserve">     public </w:t>
+      </w:r>
+      <w:proofErr w:type="spellStart"/>
+      <w:r>
+        <w:t>DateTime</w:t>
+      </w:r>
+      <w:proofErr w:type="spellEnd"/>
+      <w:r>
+        <w:t xml:space="preserve"> </w:t>
+      </w:r>
+      <w:proofErr w:type="spellStart"/>
+      <w:r>
+        <w:t>LeaveResumeDate</w:t>
+      </w:r>
+      <w:proofErr w:type="spellEnd"/>
+      <w:r>
+        <w:t xml:space="preserve"> </w:t>
+      </w:r>
+      <w:proofErr w:type="gramStart"/>
+      <w:r>
+        <w:t>{ get</w:t>
+      </w:r>
+      <w:proofErr w:type="gramEnd"/>
+      <w:r>
+        <w:t>; set</w:t>
+      </w:r>
+      <w:proofErr w:type="gramStart"/>
+      <w:r>
+        <w:t>; }</w:t>
+      </w:r>
+      <w:proofErr w:type="gramEnd"/>
+    </w:p>
+    <w:p>
+      <w:pPr>
+        <w:spacing w:after="0" w:line="240" w:lineRule="auto"/>
+      </w:pPr>
+    </w:p>
+    <w:p>
+      <w:pPr>
+        <w:spacing w:after="0" w:line="240" w:lineRule="auto"/>
+      </w:pPr>
+      <w:r>
+        <w:t xml:space="preserve">     [</w:t>
+      </w:r>
+      <w:proofErr w:type="gramStart"/>
+      <w:r>
+        <w:t>Column(</w:t>
+      </w:r>
+      <w:proofErr w:type="gramEnd"/>
+      <w:r>
+        <w:t>TypeName = "</w:t>
+      </w:r>
+      <w:proofErr w:type="gramStart"/>
+      <w:r>
+        <w:t>varchar(</w:t>
+      </w:r>
+      <w:proofErr w:type="gramEnd"/>
+      <w:r>
+        <w:t>20)")]</w:t>
+      </w:r>
+    </w:p>
+    <w:p>
+      <w:pPr>
+        <w:spacing w:after="0" w:line="240" w:lineRule="auto"/>
+      </w:pPr>
+      <w:r>
+        <w:t xml:space="preserve">     public string? </w:t>
+      </w:r>
+      <w:proofErr w:type="spellStart"/>
+      <w:r>
+        <w:t>LeaveEmpCostCenter</w:t>
+      </w:r>
+      <w:proofErr w:type="spellEnd"/>
+      <w:r>
+        <w:t xml:space="preserve"> </w:t>
+      </w:r>
+      <w:proofErr w:type="gramStart"/>
+      <w:r>
+        <w:t>{ get</w:t>
+      </w:r>
+      <w:proofErr w:type="gramEnd"/>
+      <w:r>
+        <w:t>; set</w:t>
+      </w:r>
+      <w:proofErr w:type="gramStart"/>
+      <w:r>
+        <w:t>; }</w:t>
+      </w:r>
+      <w:proofErr w:type="gramEnd"/>
+      <w:r>
+        <w:t xml:space="preserve"> = null;</w:t>
+      </w:r>
+    </w:p>
+    <w:p>
+      <w:pPr>
+        <w:spacing w:after="0" w:line="240" w:lineRule="auto"/>
+      </w:pPr>
+    </w:p>
+    <w:p>
+      <w:pPr>
+        <w:spacing w:after="0" w:line="240" w:lineRule="auto"/>
+      </w:pPr>
+      <w:r>
+        <w:t xml:space="preserve">     [</w:t>
+      </w:r>
+      <w:proofErr w:type="gramStart"/>
+      <w:r>
+        <w:t>Column(</w:t>
+      </w:r>
+      <w:proofErr w:type="gramEnd"/>
+      <w:r>
+        <w:t>TypeName = "</w:t>
+      </w:r>
+      <w:proofErr w:type="gramStart"/>
+      <w:r>
+        <w:t>varchar(</w:t>
+      </w:r>
+      <w:proofErr w:type="gramEnd"/>
+      <w:r>
+        <w:t>500)")]</w:t>
+      </w:r>
+    </w:p>
+    <w:p>
+      <w:pPr>
+        <w:spacing w:after="0" w:line="240" w:lineRule="auto"/>
+      </w:pPr>
+      <w:r>
+        <w:t xml:space="preserve">     public string? </w:t>
+      </w:r>
+      <w:proofErr w:type="spellStart"/>
+      <w:r>
+        <w:t>LeaveRemarks</w:t>
+      </w:r>
+      <w:proofErr w:type="spellEnd"/>
+      <w:r>
+        <w:t xml:space="preserve"> </w:t>
+      </w:r>
+      <w:proofErr w:type="gramStart"/>
+      <w:r>
+        <w:t>{ get</w:t>
+      </w:r>
+      <w:proofErr w:type="gramEnd"/>
+      <w:r>
+        <w:t>; set</w:t>
+      </w:r>
+      <w:proofErr w:type="gramStart"/>
+      <w:r>
+        <w:t>; }</w:t>
+      </w:r>
+      <w:proofErr w:type="gramEnd"/>
+      <w:r>
+        <w:t xml:space="preserve"> = null;</w:t>
+      </w:r>
+    </w:p>
+    <w:p>
+      <w:pPr>
+        <w:spacing w:after="0" w:line="240" w:lineRule="auto"/>
+      </w:pPr>
+    </w:p>
+    <w:p>
+      <w:pPr>
+        <w:spacing w:after="0" w:line="240" w:lineRule="auto"/>
+      </w:pPr>
+      <w:r>
+        <w:t xml:space="preserve">     [</w:t>
+      </w:r>
+      <w:proofErr w:type="gramStart"/>
+      <w:r>
+        <w:t>Column(</w:t>
+      </w:r>
+      <w:proofErr w:type="gramEnd"/>
+      <w:r>
+        <w:t>TypeName = "bit")]</w:t>
+      </w:r>
+    </w:p>
+    <w:p>
+      <w:pPr>
+        <w:spacing w:after="0" w:line="240" w:lineRule="auto"/>
+      </w:pPr>
+      <w:r>
+        <w:t xml:space="preserve">     public bool? </w:t>
+      </w:r>
+      <w:proofErr w:type="spellStart"/>
+      <w:r>
+        <w:t>LeaveConstraints</w:t>
+      </w:r>
+      <w:proofErr w:type="spellEnd"/>
+      <w:r>
+        <w:t xml:space="preserve"> </w:t>
+      </w:r>
+      <w:proofErr w:type="gramStart"/>
+      <w:r>
+        <w:t>{ get</w:t>
+      </w:r>
+      <w:proofErr w:type="gramEnd"/>
+      <w:r>
+        <w:t>; set</w:t>
+      </w:r>
+      <w:proofErr w:type="gramStart"/>
+      <w:r>
+        <w:t>; }</w:t>
+      </w:r>
+      <w:proofErr w:type="gramEnd"/>
+      <w:r>
+        <w:t xml:space="preserve"> = null;</w:t>
+      </w:r>
+    </w:p>
+    <w:p>
+      <w:pPr>
+        <w:spacing w:after="0" w:line="240" w:lineRule="auto"/>
+      </w:pPr>
+    </w:p>
+    <w:p>
+      <w:pPr>
+        <w:spacing w:after="0" w:line="240" w:lineRule="auto"/>
+      </w:pPr>
+      <w:r>
+        <w:t xml:space="preserve">     [</w:t>
+      </w:r>
+      <w:proofErr w:type="gramStart"/>
+      <w:r>
+        <w:t>Column(</w:t>
+      </w:r>
+      <w:proofErr w:type="gramEnd"/>
+      <w:r>
+        <w:t>TypeName = "</w:t>
+      </w:r>
+      <w:proofErr w:type="gramStart"/>
+      <w:r>
+        <w:t>varchar(</w:t>
+      </w:r>
+      <w:proofErr w:type="gramEnd"/>
+      <w:r>
+        <w:t>20)")]</w:t>
+      </w:r>
+    </w:p>
+    <w:p>
+      <w:pPr>
+        <w:spacing w:after="0" w:line="240" w:lineRule="auto"/>
+      </w:pPr>
+      <w:r>
+        <w:t xml:space="preserve">     public string </w:t>
+      </w:r>
+      <w:proofErr w:type="spellStart"/>
+      <w:r>
+        <w:t>LeaveStatusCode</w:t>
+      </w:r>
+      <w:proofErr w:type="spellEnd"/>
+      <w:r>
+        <w:t xml:space="preserve"> </w:t>
+      </w:r>
+      <w:proofErr w:type="gramStart"/>
+      <w:r>
+        <w:t>{ get</w:t>
+      </w:r>
+      <w:proofErr w:type="gramEnd"/>
+      <w:r>
+        <w:t>; set</w:t>
+      </w:r>
+      <w:proofErr w:type="gramStart"/>
+      <w:r>
+        <w:t>; }</w:t>
+      </w:r>
+      <w:proofErr w:type="gramEnd"/>
+      <w:r>
+        <w:t xml:space="preserve"> = </w:t>
+      </w:r>
+      <w:proofErr w:type="gramStart"/>
+      <w:r>
+        <w:t>null!;</w:t>
+      </w:r>
+      <w:proofErr w:type="gramEnd"/>
+    </w:p>
+    <w:p>
+      <w:pPr>
+        <w:spacing w:after="0" w:line="240" w:lineRule="auto"/>
+      </w:pPr>
+    </w:p>
+    <w:p>
+      <w:pPr>
+        <w:spacing w:after="0" w:line="240" w:lineRule="auto"/>
+      </w:pPr>
+      <w:r>
+        <w:t xml:space="preserve">     [</w:t>
+      </w:r>
+      <w:proofErr w:type="gramStart"/>
+      <w:r>
+        <w:t>Column(</w:t>
+      </w:r>
+      <w:proofErr w:type="gramEnd"/>
+      <w:r>
+        <w:t>TypeName = "</w:t>
+      </w:r>
+      <w:proofErr w:type="gramStart"/>
+      <w:r>
+        <w:t>char(</w:t>
+      </w:r>
+      <w:proofErr w:type="gramEnd"/>
+      <w:r>
+        <w:t>1)")]</w:t>
+      </w:r>
+    </w:p>
+    <w:p>
+      <w:pPr>
+        <w:spacing w:after="0" w:line="240" w:lineRule="auto"/>
+      </w:pPr>
+      <w:r>
+        <w:t xml:space="preserve">     public char? </w:t>
+      </w:r>
+      <w:proofErr w:type="spellStart"/>
+      <w:r>
+        <w:t>LeaveApprovalFlag</w:t>
+      </w:r>
+      <w:proofErr w:type="spellEnd"/>
+      <w:r>
+        <w:t xml:space="preserve"> </w:t>
+      </w:r>
+      <w:proofErr w:type="gramStart"/>
+      <w:r>
+        <w:t>{ get</w:t>
+      </w:r>
+      <w:proofErr w:type="gramEnd"/>
+      <w:r>
+        <w:t>; set</w:t>
+      </w:r>
+      <w:proofErr w:type="gramStart"/>
+      <w:r>
+        <w:t>; }</w:t>
+      </w:r>
+      <w:proofErr w:type="gramEnd"/>
+      <w:r>
+        <w:t xml:space="preserve"> </w:t>
+      </w:r>
+    </w:p>
+    <w:p>
+      <w:pPr>
+        <w:spacing w:after="0" w:line="240" w:lineRule="auto"/>
+      </w:pPr>
+      <w:r>
+        <w:t xml:space="preserve">        </w:t>
+      </w:r>
+    </w:p>
+    <w:p>
+      <w:pPr>
+        <w:spacing w:after="0" w:line="240" w:lineRule="auto"/>
+      </w:pPr>
+      <w:r>
+        <w:t xml:space="preserve">     [</w:t>
+      </w:r>
+      <w:proofErr w:type="gramStart"/>
+      <w:r>
+        <w:t>Column(</w:t>
+      </w:r>
+      <w:proofErr w:type="gramEnd"/>
+      <w:r>
+        <w:t>TypeName = "bit")]</w:t>
+      </w:r>
+    </w:p>
+    <w:p>
+      <w:pPr>
+        <w:spacing w:after="0" w:line="240" w:lineRule="auto"/>
+      </w:pPr>
+      <w:r>
+        <w:t xml:space="preserve">     public bool? </w:t>
+      </w:r>
+      <w:proofErr w:type="spellStart"/>
+      <w:r>
+        <w:t>LeaveVisaRequired</w:t>
+      </w:r>
+      <w:proofErr w:type="spellEnd"/>
+      <w:r>
+        <w:t xml:space="preserve"> </w:t>
+      </w:r>
+      <w:proofErr w:type="gramStart"/>
+      <w:r>
+        <w:t>{ get</w:t>
+      </w:r>
+      <w:proofErr w:type="gramEnd"/>
+      <w:r>
+        <w:t>; set</w:t>
+      </w:r>
+      <w:proofErr w:type="gramStart"/>
+      <w:r>
+        <w:t>; }</w:t>
+      </w:r>
+      <w:proofErr w:type="gramEnd"/>
+      <w:r>
+        <w:t xml:space="preserve"> = null;</w:t>
+      </w:r>
+    </w:p>
+    <w:p>
+      <w:pPr>
+        <w:spacing w:after="0" w:line="240" w:lineRule="auto"/>
+      </w:pPr>
+    </w:p>
+    <w:p>
+      <w:pPr>
+        <w:spacing w:after="0" w:line="240" w:lineRule="auto"/>
+      </w:pPr>
+      <w:r>
+        <w:t xml:space="preserve">     [</w:t>
+      </w:r>
+      <w:proofErr w:type="gramStart"/>
+      <w:r>
+        <w:t>Column(</w:t>
+      </w:r>
+      <w:proofErr w:type="gramEnd"/>
+      <w:r>
+        <w:t>TypeName = "bit")]</w:t>
+      </w:r>
+    </w:p>
+    <w:p>
+      <w:pPr>
+        <w:spacing w:after="0" w:line="240" w:lineRule="auto"/>
+      </w:pPr>
+      <w:r>
+        <w:t xml:space="preserve">     public bool? </w:t>
+      </w:r>
+      <w:proofErr w:type="spellStart"/>
+      <w:r>
+        <w:t>LeavePayAdv</w:t>
+      </w:r>
+      <w:proofErr w:type="spellEnd"/>
+      <w:r>
+        <w:t xml:space="preserve"> </w:t>
+      </w:r>
+      <w:proofErr w:type="gramStart"/>
+      <w:r>
+        <w:t>{ get</w:t>
+      </w:r>
+      <w:proofErr w:type="gramEnd"/>
+      <w:r>
+        <w:t>; set</w:t>
+      </w:r>
+      <w:proofErr w:type="gramStart"/>
+      <w:r>
+        <w:t>; }</w:t>
+      </w:r>
+      <w:proofErr w:type="gramEnd"/>
+      <w:r>
+        <w:t xml:space="preserve"> = null;</w:t>
+      </w:r>
+    </w:p>
+    <w:p>
+      <w:pPr>
+        <w:spacing w:after="0" w:line="240" w:lineRule="auto"/>
+      </w:pPr>
+    </w:p>
+    <w:p>
+      <w:pPr>
+        <w:spacing w:after="0" w:line="240" w:lineRule="auto"/>
+      </w:pPr>
+      <w:r>
+        <w:t xml:space="preserve">     [</w:t>
+      </w:r>
+      <w:proofErr w:type="gramStart"/>
+      <w:r>
+        <w:t>Column(</w:t>
+      </w:r>
+      <w:proofErr w:type="gramEnd"/>
+      <w:r>
+        <w:t>TypeName = "bit")]</w:t>
+      </w:r>
+    </w:p>
+    <w:p>
+      <w:pPr>
+        <w:spacing w:after="0" w:line="240" w:lineRule="auto"/>
+      </w:pPr>
+      <w:r>
+        <w:t xml:space="preserve">     public bool? </w:t>
+      </w:r>
+      <w:proofErr w:type="spellStart"/>
+      <w:r>
+        <w:t>LeaveIsFTMember</w:t>
+      </w:r>
+      <w:proofErr w:type="spellEnd"/>
+      <w:r>
+        <w:t xml:space="preserve"> </w:t>
+      </w:r>
+      <w:proofErr w:type="gramStart"/>
+      <w:r>
+        <w:t>{ get</w:t>
+      </w:r>
+      <w:proofErr w:type="gramEnd"/>
+      <w:r>
+        <w:t>; set</w:t>
+      </w:r>
+      <w:proofErr w:type="gramStart"/>
+      <w:r>
+        <w:t>; }</w:t>
+      </w:r>
+      <w:proofErr w:type="gramEnd"/>
+      <w:r>
+        <w:t xml:space="preserve"> = null;</w:t>
+      </w:r>
+    </w:p>
+    <w:p>
+      <w:pPr>
+        <w:spacing w:after="0" w:line="240" w:lineRule="auto"/>
+      </w:pPr>
+    </w:p>
+    <w:p>
+      <w:pPr>
+        <w:spacing w:after="0" w:line="240" w:lineRule="auto"/>
+      </w:pPr>
+      <w:r>
+        <w:t xml:space="preserve">     public double? </w:t>
+      </w:r>
+      <w:proofErr w:type="spellStart"/>
+      <w:r>
+        <w:t>LeaveBalance</w:t>
+      </w:r>
+      <w:proofErr w:type="spellEnd"/>
+      <w:r>
+        <w:t xml:space="preserve"> </w:t>
+      </w:r>
+      <w:proofErr w:type="gramStart"/>
+      <w:r>
+        <w:t>{ get</w:t>
+      </w:r>
+      <w:proofErr w:type="gramEnd"/>
+      <w:r>
+        <w:t>; set</w:t>
+      </w:r>
+      <w:proofErr w:type="gramStart"/>
+      <w:r>
+        <w:t>; }</w:t>
+      </w:r>
+      <w:proofErr w:type="gramEnd"/>
+    </w:p>
+    <w:p>
+      <w:pPr>
+        <w:spacing w:after="0" w:line="240" w:lineRule="auto"/>
+      </w:pPr>
+      <w:r>
+        <w:t xml:space="preserve">     public double? </w:t>
+      </w:r>
+      <w:proofErr w:type="spellStart"/>
+      <w:r>
+        <w:t>LeaveDuration</w:t>
+      </w:r>
+      <w:proofErr w:type="spellEnd"/>
+      <w:r>
+        <w:t xml:space="preserve"> </w:t>
+      </w:r>
+      <w:proofErr w:type="gramStart"/>
+      <w:r>
+        <w:t>{ get</w:t>
+      </w:r>
+      <w:proofErr w:type="gramEnd"/>
+      <w:r>
+        <w:t>; set</w:t>
+      </w:r>
+      <w:proofErr w:type="gramStart"/>
+      <w:r>
+        <w:t>; }</w:t>
+      </w:r>
+      <w:proofErr w:type="gramEnd"/>
+    </w:p>
+    <w:p>
+      <w:pPr>
+        <w:spacing w:after="0" w:line="240" w:lineRule="auto"/>
+      </w:pPr>
+      <w:r>
+        <w:t xml:space="preserve">     public int? </w:t>
+      </w:r>
+      <w:proofErr w:type="spellStart"/>
+      <w:r>
+        <w:t>NoOfHolidays</w:t>
+      </w:r>
+      <w:proofErr w:type="spellEnd"/>
+      <w:r>
+        <w:t xml:space="preserve"> </w:t>
+      </w:r>
+      <w:proofErr w:type="gramStart"/>
+      <w:r>
+        <w:t>{ get</w:t>
+      </w:r>
+      <w:proofErr w:type="gramEnd"/>
+      <w:r>
+        <w:t>; set</w:t>
+      </w:r>
+      <w:proofErr w:type="gramStart"/>
+      <w:r>
+        <w:t>; }</w:t>
+      </w:r>
+      <w:proofErr w:type="gramEnd"/>
+    </w:p>
+    <w:p>
+      <w:pPr>
+        <w:spacing w:after="0" w:line="240" w:lineRule="auto"/>
+      </w:pPr>
+      <w:r>
+        <w:t xml:space="preserve">     public int? </w:t>
+      </w:r>
+      <w:proofErr w:type="spellStart"/>
+      <w:r>
+        <w:t>NoOfWeekends</w:t>
+      </w:r>
+      <w:proofErr w:type="spellEnd"/>
+      <w:r>
+        <w:t xml:space="preserve"> </w:t>
+      </w:r>
+      <w:proofErr w:type="gramStart"/>
+      <w:r>
+        <w:t>{ get</w:t>
+      </w:r>
+      <w:proofErr w:type="gramEnd"/>
+      <w:r>
+        <w:t>; set</w:t>
+      </w:r>
+      <w:proofErr w:type="gramStart"/>
+      <w:r>
+        <w:t>; }</w:t>
+      </w:r>
+      <w:proofErr w:type="gramEnd"/>
+    </w:p>
+    <w:p>
+      <w:pPr>
+        <w:spacing w:after="0" w:line="240" w:lineRule="auto"/>
+      </w:pPr>
+      <w:r>
+        <w:t xml:space="preserve">        </w:t>
+      </w:r>
+    </w:p>
+    <w:p>
+      <w:pPr>
+        <w:spacing w:after="0" w:line="240" w:lineRule="auto"/>
+      </w:pPr>
+      <w:r>
+        <w:t xml:space="preserve">     [</w:t>
+      </w:r>
+      <w:proofErr w:type="gramStart"/>
+      <w:r>
+        <w:t>Column(</w:t>
+      </w:r>
+      <w:proofErr w:type="gramEnd"/>
+      <w:r>
+        <w:t>TypeName = "</w:t>
+      </w:r>
+      <w:proofErr w:type="gramStart"/>
+      <w:r>
+        <w:t>char(</w:t>
+      </w:r>
+      <w:proofErr w:type="gramEnd"/>
+      <w:r>
+        <w:t>1)")]</w:t>
+      </w:r>
+    </w:p>
+    <w:p>
+      <w:pPr>
+        <w:spacing w:after="0" w:line="240" w:lineRule="auto"/>
+      </w:pPr>
+      <w:r>
+        <w:t xml:space="preserve">     public char? </w:t>
+      </w:r>
+      <w:proofErr w:type="spellStart"/>
+      <w:r>
+        <w:t>PlannedLeave</w:t>
+      </w:r>
+      <w:proofErr w:type="spellEnd"/>
+      <w:r>
+        <w:t xml:space="preserve"> </w:t>
+      </w:r>
+      <w:proofErr w:type="gramStart"/>
+      <w:r>
+        <w:t>{ get</w:t>
+      </w:r>
+      <w:proofErr w:type="gramEnd"/>
+      <w:r>
+        <w:t>; set</w:t>
+      </w:r>
+      <w:proofErr w:type="gramStart"/>
+      <w:r>
+        <w:t>; }</w:t>
+      </w:r>
+      <w:proofErr w:type="gramEnd"/>
+    </w:p>
+    <w:p>
+      <w:pPr>
+        <w:spacing w:after="0" w:line="240" w:lineRule="auto"/>
+      </w:pPr>
+    </w:p>
+    <w:p>
+      <w:pPr>
+        <w:spacing w:after="0" w:line="240" w:lineRule="auto"/>
+      </w:pPr>
+      <w:r>
+        <w:t xml:space="preserve">     public int? </w:t>
+      </w:r>
+      <w:proofErr w:type="spellStart"/>
+      <w:r>
+        <w:t>LeavePlannedNo</w:t>
+      </w:r>
+      <w:proofErr w:type="spellEnd"/>
+      <w:r>
+        <w:t xml:space="preserve"> </w:t>
+      </w:r>
+      <w:proofErr w:type="gramStart"/>
+      <w:r>
+        <w:t>{ get</w:t>
+      </w:r>
+      <w:proofErr w:type="gramEnd"/>
+      <w:r>
+        <w:t>; set</w:t>
+      </w:r>
+      <w:proofErr w:type="gramStart"/>
+      <w:r>
+        <w:t>; }</w:t>
+      </w:r>
+      <w:proofErr w:type="gramEnd"/>
+    </w:p>
+    <w:p>
+      <w:pPr>
+        <w:spacing w:after="0" w:line="240" w:lineRule="auto"/>
+      </w:pPr>
+    </w:p>
+    <w:p>
+      <w:pPr>
+        <w:spacing w:after="0" w:line="240" w:lineRule="auto"/>
+      </w:pPr>
+      <w:r>
+        <w:t xml:space="preserve">     [</w:t>
+      </w:r>
+      <w:proofErr w:type="gramStart"/>
+      <w:r>
+        <w:t>Column(</w:t>
+      </w:r>
+      <w:proofErr w:type="gramEnd"/>
+      <w:r>
+        <w:t>TypeName = "</w:t>
+      </w:r>
+      <w:proofErr w:type="gramStart"/>
+      <w:r>
+        <w:t>char(</w:t>
+      </w:r>
+      <w:proofErr w:type="gramEnd"/>
+      <w:r>
+        <w:t>1)")]</w:t>
+      </w:r>
+    </w:p>
+    <w:p>
+      <w:pPr>
+        <w:spacing w:after="0" w:line="240" w:lineRule="auto"/>
+      </w:pPr>
+      <w:r>
+        <w:t xml:space="preserve">     public char? </w:t>
+      </w:r>
+      <w:proofErr w:type="spellStart"/>
+      <w:r>
+        <w:t>HalfDayLeaveFlag</w:t>
+      </w:r>
+      <w:proofErr w:type="spellEnd"/>
+      <w:r>
+        <w:t xml:space="preserve"> </w:t>
+      </w:r>
+      <w:proofErr w:type="gramStart"/>
+      <w:r>
+        <w:t>{ get</w:t>
+      </w:r>
+      <w:proofErr w:type="gramEnd"/>
+      <w:r>
+        <w:t>; set</w:t>
+      </w:r>
+      <w:proofErr w:type="gramStart"/>
+      <w:r>
+        <w:t>; }</w:t>
+      </w:r>
+      <w:proofErr w:type="gramEnd"/>
+    </w:p>
+    <w:p>
+      <w:pPr>
+        <w:spacing w:after="0" w:line="240" w:lineRule="auto"/>
+      </w:pPr>
+    </w:p>
+    <w:p>
+      <w:pPr>
+        <w:spacing w:after="0" w:line="240" w:lineRule="auto"/>
+      </w:pPr>
+      <w:r>
+        <w:t xml:space="preserve">     [</w:t>
+      </w:r>
+      <w:proofErr w:type="gramStart"/>
+      <w:r>
+        <w:t>Column(</w:t>
+      </w:r>
+      <w:proofErr w:type="gramEnd"/>
+      <w:r>
+        <w:t>TypeName = "datetime")]</w:t>
+      </w:r>
+    </w:p>
+    <w:p>
+      <w:pPr>
+        <w:spacing w:after="0" w:line="240" w:lineRule="auto"/>
+      </w:pPr>
+      <w:r>
+        <w:t xml:space="preserve">     public </w:t>
+      </w:r>
+      <w:proofErr w:type="spellStart"/>
+      <w:r>
+        <w:t>DateTime</w:t>
+      </w:r>
+      <w:proofErr w:type="spellEnd"/>
+      <w:r>
+        <w:t xml:space="preserve">? </w:t>
+      </w:r>
+      <w:proofErr w:type="spellStart"/>
+      <w:r>
+        <w:t>LeaveCreatedDate</w:t>
+      </w:r>
+      <w:proofErr w:type="spellEnd"/>
+      <w:r>
+        <w:t xml:space="preserve"> </w:t>
+      </w:r>
+      <w:proofErr w:type="gramStart"/>
+      <w:r>
+        <w:t>{ get</w:t>
+      </w:r>
+      <w:proofErr w:type="gramEnd"/>
+      <w:r>
+        <w:t>; set</w:t>
+      </w:r>
+      <w:proofErr w:type="gramStart"/>
+      <w:r>
+        <w:t>; }</w:t>
+      </w:r>
+      <w:proofErr w:type="gramEnd"/>
+    </w:p>
+    <w:p>
+      <w:pPr>
+        <w:spacing w:after="0" w:line="240" w:lineRule="auto"/>
+      </w:pPr>
+    </w:p>
+    <w:p>
+      <w:pPr>
+        <w:spacing w:after="0" w:line="240" w:lineRule="auto"/>
+      </w:pPr>
+      <w:r>
+        <w:t xml:space="preserve">     public int? </w:t>
+      </w:r>
+      <w:proofErr w:type="spellStart"/>
+      <w:r>
+        <w:t>LeaveCreatedBy</w:t>
+      </w:r>
+      <w:proofErr w:type="spellEnd"/>
+      <w:r>
+        <w:t xml:space="preserve"> </w:t>
+      </w:r>
+      <w:proofErr w:type="gramStart"/>
+      <w:r>
+        <w:t>{ get</w:t>
+      </w:r>
+      <w:proofErr w:type="gramEnd"/>
+      <w:r>
+        <w:t>; set</w:t>
+      </w:r>
+      <w:proofErr w:type="gramStart"/>
+      <w:r>
+        <w:t>; }</w:t>
+      </w:r>
+      <w:proofErr w:type="gramEnd"/>
+    </w:p>
+    <w:p>
+      <w:pPr>
+        <w:spacing w:after="0" w:line="240" w:lineRule="auto"/>
+      </w:pPr>
+    </w:p>
+    <w:p>
+      <w:pPr>
+        <w:spacing w:after="0" w:line="240" w:lineRule="auto"/>
+      </w:pPr>
+      <w:r>
+        <w:t xml:space="preserve">     [</w:t>
+      </w:r>
+      <w:proofErr w:type="gramStart"/>
+      <w:r>
+        <w:t>Column(</w:t>
+      </w:r>
+      <w:proofErr w:type="gramEnd"/>
+      <w:r>
+        <w:t>TypeName = "</w:t>
+      </w:r>
+      <w:proofErr w:type="gramStart"/>
+      <w:r>
+        <w:t>varchar(</w:t>
+      </w:r>
+      <w:proofErr w:type="gramEnd"/>
+      <w:r>
+        <w:t>50)")]</w:t>
+      </w:r>
+    </w:p>
+    <w:p>
+      <w:pPr>
+        <w:spacing w:after="0" w:line="240" w:lineRule="auto"/>
+      </w:pPr>
+      <w:r>
+        <w:t xml:space="preserve">     public string? </w:t>
+      </w:r>
+      <w:proofErr w:type="spellStart"/>
+      <w:r>
+        <w:t>LeaveCreatedUserID</w:t>
+      </w:r>
+      <w:proofErr w:type="spellEnd"/>
+      <w:r>
+        <w:t xml:space="preserve"> </w:t>
+      </w:r>
+      <w:proofErr w:type="gramStart"/>
+      <w:r>
+        <w:t>{ get</w:t>
+      </w:r>
+      <w:proofErr w:type="gramEnd"/>
+      <w:r>
+        <w:t>; set</w:t>
+      </w:r>
+      <w:proofErr w:type="gramStart"/>
+      <w:r>
+        <w:t>; }</w:t>
+      </w:r>
+      <w:proofErr w:type="gramEnd"/>
+      <w:r>
+        <w:t xml:space="preserve"> = null;</w:t>
+      </w:r>
+    </w:p>
+    <w:p>
+      <w:pPr>
+        <w:spacing w:after="0" w:line="240" w:lineRule="auto"/>
+      </w:pPr>
+    </w:p>
+    <w:p>
+      <w:pPr>
+        <w:spacing w:after="0" w:line="240" w:lineRule="auto"/>
+      </w:pPr>
+      <w:r>
+        <w:t xml:space="preserve">     [</w:t>
+      </w:r>
+      <w:proofErr w:type="gramStart"/>
+      <w:r>
+        <w:t>Column(</w:t>
+      </w:r>
+      <w:proofErr w:type="gramEnd"/>
+      <w:r>
+        <w:t>TypeName = "</w:t>
+      </w:r>
+      <w:proofErr w:type="gramStart"/>
+      <w:r>
+        <w:t>varchar(</w:t>
+      </w:r>
+      <w:proofErr w:type="gramEnd"/>
+      <w:r>
+        <w:t>50)")]</w:t>
+      </w:r>
+    </w:p>
+    <w:p>
+      <w:pPr>
+        <w:spacing w:after="0" w:line="240" w:lineRule="auto"/>
+      </w:pPr>
+      <w:r>
+        <w:t xml:space="preserve">     public string? </w:t>
+      </w:r>
+      <w:proofErr w:type="spellStart"/>
+      <w:r>
+        <w:t>LeaveCreatedEmail</w:t>
+      </w:r>
+      <w:proofErr w:type="spellEnd"/>
+      <w:r>
+        <w:t xml:space="preserve"> </w:t>
+      </w:r>
+      <w:proofErr w:type="gramStart"/>
+      <w:r>
+        <w:t>{ get</w:t>
+      </w:r>
+      <w:proofErr w:type="gramEnd"/>
+      <w:r>
+        <w:t>; set</w:t>
+      </w:r>
+      <w:proofErr w:type="gramStart"/>
+      <w:r>
+        <w:t>; }</w:t>
+      </w:r>
+      <w:proofErr w:type="gramEnd"/>
+      <w:r>
+        <w:t xml:space="preserve"> = null;</w:t>
+      </w:r>
+    </w:p>
+    <w:p>
+      <w:pPr>
+        <w:spacing w:after="0" w:line="240" w:lineRule="auto"/>
+      </w:pPr>
+    </w:p>
+    <w:p>
+      <w:pPr>
+        <w:spacing w:after="0" w:line="240" w:lineRule="auto"/>
+      </w:pPr>
+      <w:r>
+        <w:t xml:space="preserve">     [</w:t>
+      </w:r>
+      <w:proofErr w:type="gramStart"/>
+      <w:r>
+        <w:t>Column(</w:t>
+      </w:r>
+      <w:proofErr w:type="gramEnd"/>
+      <w:r>
+        <w:t>TypeName = "datetime")]</w:t>
+      </w:r>
+    </w:p>
+    <w:p>
+      <w:pPr>
+        <w:spacing w:after="0" w:line="240" w:lineRule="auto"/>
+      </w:pPr>
+      <w:r>
+        <w:t xml:space="preserve">     public </w:t>
+      </w:r>
+      <w:proofErr w:type="spellStart"/>
+      <w:r>
+        <w:t>DateTime</w:t>
+      </w:r>
+      <w:proofErr w:type="spellEnd"/>
+      <w:r>
+        <w:t xml:space="preserve">? </w:t>
+      </w:r>
+      <w:proofErr w:type="spellStart"/>
+      <w:r>
+        <w:t>LeaveUpdatedDate</w:t>
+      </w:r>
+      <w:proofErr w:type="spellEnd"/>
+      <w:r>
+        <w:t xml:space="preserve"> </w:t>
+      </w:r>
+      <w:proofErr w:type="gramStart"/>
+      <w:r>
+        <w:t>{ get</w:t>
+      </w:r>
+      <w:proofErr w:type="gramEnd"/>
+      <w:r>
+        <w:t>; set</w:t>
+      </w:r>
+      <w:proofErr w:type="gramStart"/>
+      <w:r>
+        <w:t>; }</w:t>
+      </w:r>
+      <w:proofErr w:type="gramEnd"/>
+    </w:p>
+    <w:p>
+      <w:pPr>
+        <w:spacing w:after="0" w:line="240" w:lineRule="auto"/>
+      </w:pPr>
+    </w:p>
+    <w:p>
+      <w:pPr>
+        <w:spacing w:after="0" w:line="240" w:lineRule="auto"/>
+      </w:pPr>
+      <w:r>
+        <w:t xml:space="preserve">     public int? </w:t>
+      </w:r>
+      <w:proofErr w:type="spellStart"/>
+      <w:r>
+        <w:t>LeaveUpdatedBy</w:t>
+      </w:r>
+      <w:proofErr w:type="spellEnd"/>
+      <w:r>
+        <w:t xml:space="preserve"> </w:t>
+      </w:r>
+      <w:proofErr w:type="gramStart"/>
+      <w:r>
+        <w:t>{ get</w:t>
+      </w:r>
+      <w:proofErr w:type="gramEnd"/>
+      <w:r>
+        <w:t>; set</w:t>
+      </w:r>
+      <w:proofErr w:type="gramStart"/>
+      <w:r>
+        <w:t>; }</w:t>
+      </w:r>
+      <w:proofErr w:type="gramEnd"/>
+    </w:p>
+    <w:p>
+      <w:pPr>
+        <w:spacing w:after="0" w:line="240" w:lineRule="auto"/>
+      </w:pPr>
+    </w:p>
+    <w:p>
+      <w:pPr>
+        <w:spacing w:after="0" w:line="240" w:lineRule="auto"/>
+      </w:pPr>
+      <w:r>
+        <w:t xml:space="preserve">     [</w:t>
+      </w:r>
+      <w:proofErr w:type="gramStart"/>
+      <w:r>
+        <w:t>Column(</w:t>
+      </w:r>
+      <w:proofErr w:type="gramEnd"/>
+      <w:r>
+        <w:t>TypeName = "</w:t>
+      </w:r>
+      <w:proofErr w:type="gramStart"/>
+      <w:r>
+        <w:t>varchar(</w:t>
+      </w:r>
+      <w:proofErr w:type="gramEnd"/>
+      <w:r>
+        <w:t>50)")]</w:t>
+      </w:r>
+    </w:p>
+    <w:p>
+      <w:pPr>
+        <w:spacing w:after="0" w:line="240" w:lineRule="auto"/>
+      </w:pPr>
+      <w:r>
+        <w:t xml:space="preserve">     public string? </w:t>
+      </w:r>
+      <w:proofErr w:type="spellStart"/>
+      <w:r>
+        <w:t>LeaveUpdatedUserID</w:t>
+      </w:r>
+      <w:proofErr w:type="spellEnd"/>
+      <w:r>
+        <w:t xml:space="preserve"> </w:t>
+      </w:r>
+      <w:proofErr w:type="gramStart"/>
+      <w:r>
+        <w:t>{ get</w:t>
+      </w:r>
+      <w:proofErr w:type="gramEnd"/>
+      <w:r>
+        <w:t>; set</w:t>
+      </w:r>
+      <w:proofErr w:type="gramStart"/>
+      <w:r>
+        <w:t>; }</w:t>
+      </w:r>
+      <w:proofErr w:type="gramEnd"/>
+      <w:r>
+        <w:t xml:space="preserve"> = null;</w:t>
+      </w:r>
+    </w:p>
+    <w:p>
+      <w:pPr>
+        <w:spacing w:after="0" w:line="240" w:lineRule="auto"/>
+      </w:pPr>
+    </w:p>
+    <w:p>
+      <w:pPr>
+        <w:spacing w:after="0" w:line="240" w:lineRule="auto"/>
+      </w:pPr>
+      <w:r>
+        <w:t xml:space="preserve">     [</w:t>
+      </w:r>
+      <w:proofErr w:type="gramStart"/>
+      <w:r>
+        <w:t>Column(</w:t>
+      </w:r>
+      <w:proofErr w:type="gramEnd"/>
+      <w:r>
+        <w:t>TypeName = "</w:t>
+      </w:r>
+      <w:proofErr w:type="gramStart"/>
+      <w:r>
+        <w:t>varchar(</w:t>
+      </w:r>
+      <w:proofErr w:type="gramEnd"/>
+      <w:r>
+        <w:t>50)")]</w:t>
+      </w:r>
+    </w:p>
+    <w:p>
+      <w:pPr>
+        <w:spacing w:after="0" w:line="240" w:lineRule="auto"/>
+      </w:pPr>
+      <w:r>
+        <w:t xml:space="preserve">     public string? </w:t>
+      </w:r>
+      <w:proofErr w:type="spellStart"/>
+      <w:r>
+        <w:t>LeaveUpdatedEmail</w:t>
+      </w:r>
+      <w:proofErr w:type="spellEnd"/>
+      <w:r>
+        <w:t xml:space="preserve"> </w:t>
+      </w:r>
+      <w:proofErr w:type="gramStart"/>
+      <w:r>
+        <w:t>{ get</w:t>
+      </w:r>
+      <w:proofErr w:type="gramEnd"/>
+      <w:r>
+        <w:t>; set</w:t>
+      </w:r>
+      <w:proofErr w:type="gramStart"/>
+      <w:r>
+        <w:t>; }</w:t>
+      </w:r>
+      <w:proofErr w:type="gramEnd"/>
+      <w:r>
+        <w:t xml:space="preserve"> = null;</w:t>
+      </w:r>
+    </w:p>
+    <w:p>
+      <w:pPr>
+        <w:spacing w:after="0" w:line="240" w:lineRule="auto"/>
+      </w:pPr>
+      <w:r>
+        <w:t xml:space="preserve">     #endregion</w:t>
+      </w:r>
+    </w:p>
+    <w:p>
+      <w:pPr>
+        <w:spacing w:after="0" w:line="240" w:lineRule="auto"/>
+      </w:pPr>
+    </w:p>
+    <w:p>
+      <w:pPr>
+        <w:spacing w:after="0" w:line="240" w:lineRule="auto"/>
+      </w:pPr>
+      <w:r>
+        <w:t xml:space="preserve">     #region Extended Properties</w:t>
+      </w:r>
+    </w:p>
+    <w:p>
+      <w:pPr>
+        <w:spacing w:after="0" w:line="240" w:lineRule="auto"/>
+      </w:pPr>
+      <w:r>
+        <w:t xml:space="preserve">     public int? </w:t>
+      </w:r>
+      <w:proofErr w:type="spellStart"/>
+      <w:r>
+        <w:t>LeaveStatusID</w:t>
+      </w:r>
+      <w:proofErr w:type="spellEnd"/>
+      <w:r>
+        <w:t xml:space="preserve"> </w:t>
+      </w:r>
+      <w:proofErr w:type="gramStart"/>
+      <w:r>
+        <w:t>{ get</w:t>
+      </w:r>
+      <w:proofErr w:type="gramEnd"/>
+      <w:r>
+        <w:t>; set</w:t>
+      </w:r>
+      <w:proofErr w:type="gramStart"/>
+      <w:r>
+        <w:t>; }</w:t>
+      </w:r>
+      <w:proofErr w:type="gramEnd"/>
+    </w:p>
+    <w:p>
+      <w:pPr>
+        <w:spacing w:after="0" w:line="240" w:lineRule="auto"/>
+      </w:pPr>
+    </w:p>
+    <w:p>
+      <w:pPr>
+        <w:spacing w:after="0" w:line="240" w:lineRule="auto"/>
+      </w:pPr>
+      <w:r>
+        <w:t xml:space="preserve">     [</w:t>
+      </w:r>
+      <w:proofErr w:type="gramStart"/>
+      <w:r>
+        <w:t>Column(</w:t>
+      </w:r>
+      <w:proofErr w:type="gramEnd"/>
+      <w:r>
+        <w:t>TypeName = "</w:t>
+      </w:r>
+      <w:proofErr w:type="gramStart"/>
+      <w:r>
+        <w:t>varchar(</w:t>
+      </w:r>
+      <w:proofErr w:type="gramEnd"/>
+      <w:r>
+        <w:t>20)")]</w:t>
+      </w:r>
+    </w:p>
+    <w:p>
+      <w:pPr>
+        <w:spacing w:after="0" w:line="240" w:lineRule="auto"/>
+      </w:pPr>
+      <w:r>
+        <w:t xml:space="preserve">     public string? </w:t>
+      </w:r>
+      <w:proofErr w:type="spellStart"/>
+      <w:r>
+        <w:t>StatusHandlingCode</w:t>
+      </w:r>
+      <w:proofErr w:type="spellEnd"/>
+      <w:r>
+        <w:t xml:space="preserve"> </w:t>
+      </w:r>
+      <w:proofErr w:type="gramStart"/>
+      <w:r>
+        <w:t>{ get</w:t>
+      </w:r>
+      <w:proofErr w:type="gramEnd"/>
+      <w:r>
+        <w:t>; set</w:t>
+      </w:r>
+      <w:proofErr w:type="gramStart"/>
+      <w:r>
+        <w:t>; }</w:t>
+      </w:r>
+      <w:proofErr w:type="gramEnd"/>
+      <w:r>
+        <w:t xml:space="preserve"> = null;</w:t>
+      </w:r>
+    </w:p>
+    <w:p>
+      <w:pPr>
+        <w:spacing w:after="0" w:line="240" w:lineRule="auto"/>
+      </w:pPr>
+    </w:p>
+    <w:p>
+      <w:pPr>
+        <w:spacing w:after="0" w:line="240" w:lineRule="auto"/>
+      </w:pPr>
+      <w:r>
+        <w:t xml:space="preserve">     [</w:t>
+      </w:r>
+      <w:proofErr w:type="gramStart"/>
+      <w:r>
+        <w:t>Column(</w:t>
+      </w:r>
+      <w:proofErr w:type="gramEnd"/>
+      <w:r>
+        <w:t>TypeName = "</w:t>
+      </w:r>
+      <w:proofErr w:type="gramStart"/>
+      <w:r>
+        <w:t>varchar(</w:t>
+      </w:r>
+      <w:proofErr w:type="gramEnd"/>
+      <w:r>
+        <w:t>20)")]</w:t>
+      </w:r>
+    </w:p>
+    <w:p>
+      <w:pPr>
+        <w:spacing w:after="0" w:line="240" w:lineRule="auto"/>
+      </w:pPr>
+      <w:r>
+        <w:t xml:space="preserve">     public string? </w:t>
+      </w:r>
+      <w:proofErr w:type="spellStart"/>
+      <w:r>
+        <w:t>StartDayMode</w:t>
+      </w:r>
+      <w:proofErr w:type="spellEnd"/>
+      <w:r>
+        <w:t xml:space="preserve"> </w:t>
+      </w:r>
+      <w:proofErr w:type="gramStart"/>
+      <w:r>
+        <w:t>{ get</w:t>
+      </w:r>
+      <w:proofErr w:type="gramEnd"/>
+      <w:r>
+        <w:t>; set</w:t>
+      </w:r>
+      <w:proofErr w:type="gramStart"/>
+      <w:r>
+        <w:t>; }</w:t>
+      </w:r>
+      <w:proofErr w:type="gramEnd"/>
+      <w:r>
+        <w:t xml:space="preserve"> = null;</w:t>
+      </w:r>
+    </w:p>
+    <w:p>
+      <w:pPr>
+        <w:spacing w:after="0" w:line="240" w:lineRule="auto"/>
+      </w:pPr>
+    </w:p>
+    <w:p>
+      <w:pPr>
+        <w:spacing w:after="0" w:line="240" w:lineRule="auto"/>
+      </w:pPr>
+      <w:r>
+        <w:t xml:space="preserve">     [</w:t>
+      </w:r>
+      <w:proofErr w:type="gramStart"/>
+      <w:r>
+        <w:t>Column(</w:t>
+      </w:r>
+      <w:proofErr w:type="gramEnd"/>
+      <w:r>
+        <w:t>TypeName = "</w:t>
+      </w:r>
+      <w:proofErr w:type="gramStart"/>
+      <w:r>
+        <w:t>varchar(</w:t>
+      </w:r>
+      <w:proofErr w:type="gramEnd"/>
+      <w:r>
+        <w:t>20)")]</w:t>
+      </w:r>
+    </w:p>
+    <w:p>
+      <w:pPr>
+        <w:spacing w:after="0" w:line="240" w:lineRule="auto"/>
+      </w:pPr>
+      <w:r>
+        <w:t xml:space="preserve">     public string? </w:t>
+      </w:r>
+      <w:proofErr w:type="spellStart"/>
+      <w:r>
+        <w:t>EndDayMode</w:t>
+      </w:r>
+      <w:proofErr w:type="spellEnd"/>
+      <w:r>
+        <w:t xml:space="preserve"> </w:t>
+      </w:r>
+      <w:proofErr w:type="gramStart"/>
+      <w:r>
+        <w:t>{ get</w:t>
+      </w:r>
+      <w:proofErr w:type="gramEnd"/>
+      <w:r>
+        <w:t>; set</w:t>
+      </w:r>
+      <w:proofErr w:type="gramStart"/>
+      <w:r>
+        <w:t>; }</w:t>
+      </w:r>
+      <w:proofErr w:type="gramEnd"/>
+      <w:r>
+        <w:t xml:space="preserve"> = null;               </w:t>
+      </w:r>
+    </w:p>
+    <w:p>
+      <w:pPr>
+        <w:spacing w:after="0" w:line="240" w:lineRule="auto"/>
+      </w:pPr>
+      <w:r>
+        <w:t xml:space="preserve">     #endregion</w:t>
+      </w:r>
+    </w:p>
+    <w:p>
+      <w:pPr>
+        <w:spacing w:after="0" w:line="240" w:lineRule="auto"/>
+      </w:pPr>
+    </w:p>
+    <w:p>
+      <w:pPr>
+        <w:spacing w:after="0" w:line="240" w:lineRule="auto"/>
+        <w:rPr>
+          <w:lang w:val="en-GB"/>
+        </w:rPr>
+      </w:pPr>
+      <w:r>
+        <w:t>}</w:t>
+      </w:r>
     </w:p>
     <w:sectPr>
       <w:pgSz w:w="12240" w:h="15840"/>

</xml_diff>